<commit_message>
Week 4 Saturday: the 13 October fact check folded into the paper
M5's 1,972 teams are the ones that beat the seasonal naive, 35.8 percent
of 5,507; the 2016 Wells Fargo penalties are named by agency; the SEC
order's 365-day inactive accounts join the key's reasoning.

Co-Authored-By: Claude Opus 5.5 <noreply@anthropic.com>
Claude-Session: https://claude.ai/code/session_01M3TYrKwqBYtaKqFgbeoeQn
</commit_message>
<xml_diff>
--- a/content/W04/SAT/answer-key/C2_W04_SAT_answer_key_TRAINER.docx
+++ b/content/W04/SAT/answer-key/C2_W04_SAT_answer_key_TRAINER.docx
@@ -15173,7 +15173,7 @@
                 <w:sz w:val="21"/>
                 <w:szCs w:val="21"/>
               </w:rPr>
-              <w:t xml:space="preserve">True. Staff measured on the cross-sell count changed what they did to move it, in ways the bank never meant: accounts customers had not asked for, money moved in so a new account counted as funded, and contact details changed so surveys missed the customers (SEC order, Release 34-88257, checked 13 October 2026). The same thing happened on a smaller scale in Hyderabad, where 180 drivers took their peak online hours to 2.1 times while their trips fell 12 percent. The CFPB's 2016 penalties came to USD 185 million and the 2020 settlement with the SEC and the Justice Department to USD 3 billion.</w:t>
+              <w:t xml:space="preserve">True. Staff measured on the cross-sell count changed what they did to move it, in ways the bank never meant: accounts customers had not asked for, money moved in so a new account counted as funded, and contact details changed so surveys missed the customers (SEC order, Release 34-88257, checked 13 October 2026). The same thing happened on a smaller scale in Hyderabad, where 180 drivers took their peak online hours to 2.1 times while their trips fell 12 percent. The 2016 penalties, the CFPB's USD 100 million with the OCC's USD 35 million and Los Angeles's USD 50 million, came to USD 185 million (the CFPB's release of 8 September 2016, checked 13 October 2026), and the 2020 settlement with the SEC and the Justice Department to USD 3 billion.</w:t>
             </w:r>
           </w:p>
           <w:p>
@@ -15402,7 +15402,7 @@
                 <w:sz w:val="21"/>
                 <w:szCs w:val="21"/>
               </w:rPr>
-              <w:t xml:space="preserve">0.04 of the 0.11 rise is about 36 percent, and it came from counting a new kind of account, so that much of the year's rise reflected no change in what households held. The line that shows it is the dated change log: every change to what is counted carries a date and a note, and the year of the change prints the ratio on both definitions so a reader can see the step. The SEC's order (Release 34-88257, checked 13 October 2026) says investors were not told of the 2013 addition, which is the breach.</w:t>
+              <w:t xml:space="preserve">0.04 of the 0.11 rise is about 36 percent, and it came from counting a new kind of account, so that much of the year's rise reflected no change in what households held. The line that shows it is the dated change log: every change to what is counted carries a date and a note, and the year of the change prints the ratio on both definitions so a reader can see the step. The SEC's order (Release 34-88257, checked 13 October 2026) says investors were not told of the 2013 addition, which is the breach, and that the rest of the 0.11 came from accounts and products inactive for at least 365 days, so none of the year's rise was households using more.</w:t>
             </w:r>
           </w:p>
           <w:p>
@@ -20425,7 +20425,7 @@
                 <w:sz w:val="21"/>
                 <w:szCs w:val="21"/>
               </w:rPr>
-              <w:t xml:space="preserve">M5 judged every entry on days it never saw, and on that test the seasonal naive, at 0.847, beat the perceptron's 0.977 and the random forest's 1.010, and only 35.8 percent of 1,972 teams beat it; the top entries that did win were machine learning, which is why the honest test is the same for any model. The vendor's curve fits its 91 training weeks within 1.4 percent, and on the thirteen hidden weeks it missed by 16,400 shipments a week against the seasonal naive's 9,831, almost all of it too high. Makridakis and colleagues (PLOS ONE, 2018) made the same point on 1,045 monthly series: the models that fitted best did not necessarily forecast best.</w:t>
+              <w:t xml:space="preserve">M5 judged every entry on days it never saw, and on that test the seasonal naive, at 0.847, beat the perceptron's 0.977 and the random forest's 1.010, and only 1,972 of the 5,507 teams, 35.8 percent, beat it; the top entries that did win were machine learning, which is why the honest test is the same for any model. The vendor's curve fits its 91 training weeks within 1.4 percent, and on the thirteen hidden weeks it missed by 16,400 shipments a week against the seasonal naive's 9,831, almost all of it too high. Makridakis and colleagues (PLOS ONE, 2018) made the same point on 1,045 monthly series: the models that fitted best did not necessarily forecast best.</w:t>
             </w:r>
           </w:p>
           <w:p>

</xml_diff>

<commit_message>
Week 4 Saturday: the discussion guide, the transfer drill, the mock round and the Week 5 bridge
The guide runs the 60-minute discussion: the most-missed items from the
workbook with a candidate table, then ten anchors answered aloud. The drill
carries eight briefs with their answer grids, the mock round the week's
transcript questions with a seven-line card, and the bridge ties each Week 5
day to the Week 4 habit it leans on. The key's reasons on Q34, Q35 and Q39
now rest only on checked facts.

Co-Authored-By: Claude Opus 5.5 <noreply@anthropic.com>
Claude-Session: https://claude.ai/code/session_01M3TYrKwqBYtaKqFgbeoeQn
</commit_message>
<xml_diff>
--- a/content/W04/SAT/answer-key/C2_W04_SAT_answer_key_TRAINER.docx
+++ b/content/W04/SAT/answer-key/C2_W04_SAT_answer_key_TRAINER.docx
@@ -17072,7 +17072,7 @@
                 <w:sz w:val="20"/>
                 <w:szCs w:val="20"/>
               </w:rPr>
-              <w:t xml:space="preserve">The boardings record was reported as beating the earlier record of more than 81 lakh passenger journeys, so the two are reported as one count; and whatever a boarding counts, 17 September 2026 was a record day during a bus strike.</w:t>
+              <w:t xml:space="preserve">Whatever a boarding counts, 17 September 2026 was one record day during a bus strike, so it cannot check an ordinary weekday. DMRC also called it its highest-ever, above the earlier record of more than 81 lakh passenger journeys on 8 August 2025 (The Tribune, 9 August 2026, checked 13 October 2026), which reads boardings and journeys as one count; that reading is ours, since neither source defines a boarding.</w:t>
             </w:r>
           </w:p>
           <w:p>
@@ -21139,7 +21139,7 @@
                 <w:sz w:val="20"/>
                 <w:szCs w:val="20"/>
               </w:rPr>
-              <w:t xml:space="preserve">The rupee cost of a wrong nudge is the line that changes most: in lending one direction costs twenty times the other, where Retail's two errors cost about the same.</w:t>
+              <w:t xml:space="preserve">The rupee cost of a wrong nudge is the line that changes most: in lending a wrong approval costs twenty times a wrongful rejection, while on the Retail tables a wasted nudge costs a small discount and some annoyance, so the threshold moves.</w:t>
             </w:r>
           </w:p>
           <w:p>
@@ -21287,7 +21287,7 @@
                 <w:sz w:val="21"/>
                 <w:szCs w:val="21"/>
               </w:rPr>
-              <w:t xml:space="preserve">The rate's window ends at a promised date the measured dispatchers can move, the way Phoenix's wait times started at a "desired date" staff entered; the fix fixes the promise when the order is placed and guards it with the share of promises moved. What changed from Uber: the people who move the number are dispatchers, and the cost of an error is a customer told a parcel was on time when it was not.</w:t>
+              <w:t xml:space="preserve">The rate's window ends at a promised date the measured dispatchers can move, the way the Phoenix VA's wait times ran from a "desired date" that 30 of 79 schedulers interviewed said they entered wrongly (VA Office of Inspector General, report 14-02603-267, 26 August 2014, checked 13 October 2026); the fix fixes the promise when the order is placed and guards it with the share of promises moved. What changed from Uber: the people who move the number are dispatchers, and the cost of an error is a customer told a parcel was on time when it was not.</w:t>
             </w:r>
           </w:p>
           <w:p>
@@ -21960,7 +21960,7 @@
                 <w:sz w:val="20"/>
                 <w:szCs w:val="20"/>
               </w:rPr>
-              <w:t xml:space="preserve">The share is right, and the calendar copy is the part that never carries over: Diwali moves, and the sale moves with it.</w:t>
+              <w:t xml:space="preserve">The share is right, and the calendar copy is the part that never carries over: Diwali moves, from 20 October 2025 to 8 November 2026, so Lucknow's plan copied last year's weeks by their distance from the festival, and that alignment to the event that drives the peak is what carries over.</w:t>
             </w:r>
           </w:p>
           <w:p>

</xml_diff>

<commit_message>
Week 4 Saturday: fix pass on the learner's cold read
Exhibit 1D now says every window placement was an auto-reorder that then
failed, which removes the second reading of Q7. Q10's stem prints the
numbers its keyed reply uses, Exhibit 2B prints DMRC's counting rule and
the record day, Exhibit 1C says how staff were judged, Q24's option c no
longer prints Q22's answer, and seven stems, options and captions read one
way only. Q32 is paced at five minutes.

Co-Authored-By: Claude Opus 5.5 <noreply@anthropic.com>
Claude-Session: https://claude.ai/code/session_01M3TYrKwqBYtaKqFgbeoeQn
</commit_message>
<xml_diff>
--- a/content/W04/SAT/answer-key/C2_W04_SAT_answer_key_TRAINER.docx
+++ b/content/W04/SAT/answer-key/C2_W04_SAT_answer_key_TRAINER.docx
@@ -1853,7 +1853,7 @@
                 <w:sz w:val="18"/>
                 <w:szCs w:val="18"/>
               </w:rPr>
-              <w:t xml:space="preserve">19</w:t>
+              <w:t xml:space="preserve">20</w:t>
             </w:r>
           </w:p>
         </w:tc>
@@ -2437,7 +2437,7 @@
                 <w:sz w:val="18"/>
                 <w:szCs w:val="18"/>
               </w:rPr>
-              <w:t xml:space="preserve">117</w:t>
+              <w:t xml:space="preserve">118</w:t>
             </w:r>
           </w:p>
         </w:tc>
@@ -22382,7 +22382,7 @@
           <w:sz w:val="21"/>
           <w:szCs w:val="21"/>
         </w:rPr>
-        <w:t xml:space="preserve">Q6 (One correct option, Hard, [F]): Exhibit 1C's last row is the 2013 change. What share of Wells Fargo's 2013 rise in the ratio came from the change of definition alone, and which line of a complete metric definition would have shown it to investors?</w:t>
+        <w:t xml:space="preserve">Q6 (One correct option, Hard, [F]): Exhibit 1C's last row is the 2013 change. What share of Wells Fargo's 2013 rise in the ratio came from the change of definition alone, and what record kept beside the definition would have shown it to investors?</w:t>
       </w:r>
     </w:p>
     <w:p>
@@ -22420,7 +22420,7 @@
           <w:sz w:val="21"/>
           <w:szCs w:val="21"/>
         </w:rPr>
-        <w:t xml:space="preserve">Q8 (Order the steps, Hard, [S]): Four of these six lines make the city head's slide, and two would spoil it. Leave those two out and write the other four in the order they appear on the slide, from the top.</w:t>
+        <w:t xml:space="preserve">Q8 (Order the steps, Hard, [S]): Four of these six lines make the city head's slide, and two would spoil it. Leave those two out and write the other four in the order Tuesday's one-slide template puts them, from the top.</w:t>
       </w:r>
     </w:p>
     <w:p>
@@ -22458,7 +22458,7 @@
           <w:sz w:val="21"/>
           <w:szCs w:val="21"/>
         </w:rPr>
-        <w:t xml:space="preserve">Q10 (True or false, Hard, [F]): At the review the finance partner says: "The fall in bookings per hour is the monsoon's end, not your scheme." Statement: the strongest reply concedes nothing, since any concession hands the objector the meeting. True or false, and why?</w:t>
+        <w:t xml:space="preserve">Q10 (True or false, Hard, [F]): At the review the finance partner says: "The fall in bookings per hour is the monsoon's end, not your scheme." In the last three of the six weeks after the launch, weekly peak rider requests ran from 41,161 to 42,602, against 41,155 to 42,719 in the six weeks before, and trips per peak online hour ran at 1.56. Statement: the strongest reply concedes nothing, since any concession hands the objector the meeting. True or false, and why?</w:t>
       </w:r>
     </w:p>
     <w:p>
@@ -22515,7 +22515,7 @@
           <w:sz w:val="21"/>
           <w:szCs w:val="21"/>
         </w:rPr>
-        <w:t xml:space="preserve">Q13 (More than one correct, Hard, [S]): Before the review, a colleague lines up four published numbers to check estimates against. Which checks are sound? Mark every correct option.</w:t>
+        <w:t xml:space="preserve">Q13 (More than one correct, Hard, [S]): Before the review, a colleague lines up four numbers to check estimates against: NPCI's UPI count as Outlook Money reported it, Flipkart Stories' post of 9 October 2026, Avenue Supermarts' FY26 release for DMart, and a city invented for a drill. Which checks are sound? Mark every correct option.</w:t>
       </w:r>
     </w:p>
     <w:p>
@@ -22629,7 +22629,7 @@
           <w:sz w:val="21"/>
           <w:szCs w:val="21"/>
         </w:rPr>
-        <w:t xml:space="preserve">Q25 (One correct option, Hard, [S]): The membership lead's chart for September reads "search to menu view: 118 percent" and "menu view to add-to-cart: 34 percent, the biggest loss". Exhibit 4C counts the same flow two ways. Which reading holds?</w:t>
+        <w:t xml:space="preserve">Q25 (One correct option, Hard, [S]): The membership lead's chart for September reads "search to menu view: 118 percent" and "menu view to add-to-cart: 34 percent, the biggest loss". Exhibit 4C counts the same flow two ways, for September alone. Which reading holds?</w:t>
       </w:r>
     </w:p>
     <w:p>
@@ -22705,7 +22705,7 @@
           <w:sz w:val="21"/>
           <w:szCs w:val="21"/>
         </w:rPr>
-        <w:t xml:space="preserve">Q30 (Applied maths, Hard, [F]): Anand's board line needs October and November 2026. Using Exhibits 5A and 5B, give the seasonal naive for both months, then the festival-aligned copy, last year's Diwali month plus 4 percent, for whichever 2026 month holds Diwali, and say which month should carry the festival's spike.</w:t>
+        <w:t xml:space="preserve">Q30 (Applied maths, Hard, [F]): Anand's board line needs October and November 2026. Using Exhibits 5A and 5B, give the seasonal naive for both months, then the festival-aligned copy, last year's Diwali month plus 4 percent, for the one 2026 month that holds Diwali, and say which month should carry the festival's spike.</w:t>
       </w:r>
     </w:p>
     <w:p>

</xml_diff>

<commit_message>
Week 4 Saturday: fix pass on the hiring interviewer's cold read
Q11's keyed option now says only what Amazon's letter says. Fourteen items
the interviewer read as medium are hardened with the read's own rewrites:
distractors that share the key's numbers and differ in judgment (Q4, Q6,
Q10, Q24, Q26, Q27, Q28, Q31), a claim title on the flattering denominator
in Q8, a wrong-unit check in Q12, a wrong-period check in Q13, and stems
that no longer name the method or the date (Q30, Q33). Q30's key accepts
part of the run-up in late October. Levels: 8 easy, 8 medium, 23 hard.

Co-Authored-By: Claude Opus 5.5 <noreply@anthropic.com>
Claude-Session: https://claude.ai/code/session_01M3TYrKwqBYtaKqFgbeoeQn
</commit_message>
<xml_diff>
--- a/content/W04/SAT/answer-key/C2_W04_SAT_answer_key_TRAINER.docx
+++ b/content/W04/SAT/answer-key/C2_W04_SAT_answer_key_TRAINER.docx
@@ -725,7 +725,7 @@
                 <w:sz w:val="18"/>
                 <w:szCs w:val="18"/>
               </w:rPr>
-              <w:t xml:space="preserve">1</w:t>
+              <w:t xml:space="preserve">2</w:t>
             </w:r>
           </w:p>
         </w:tc>
@@ -761,7 +761,7 @@
                 <w:sz w:val="18"/>
                 <w:szCs w:val="18"/>
               </w:rPr>
-              <w:t xml:space="preserve">3</w:t>
+              <w:t xml:space="preserve">2</w:t>
             </w:r>
           </w:p>
         </w:tc>
@@ -1016,7 +1016,7 @@
                 <w:sz w:val="18"/>
                 <w:szCs w:val="18"/>
               </w:rPr>
-              <w:t xml:space="preserve">0</w:t>
+              <w:t xml:space="preserve">1</w:t>
             </w:r>
           </w:p>
         </w:tc>
@@ -1052,7 +1052,7 @@
                 <w:sz w:val="18"/>
                 <w:szCs w:val="18"/>
               </w:rPr>
-              <w:t xml:space="preserve">2</w:t>
+              <w:t xml:space="preserve">0</w:t>
             </w:r>
           </w:p>
         </w:tc>
@@ -1088,7 +1088,7 @@
                 <w:sz w:val="18"/>
                 <w:szCs w:val="18"/>
               </w:rPr>
-              <w:t xml:space="preserve">5</w:t>
+              <w:t xml:space="preserve">6</w:t>
             </w:r>
           </w:p>
         </w:tc>
@@ -2180,7 +2180,7 @@
                 <w:sz w:val="18"/>
                 <w:szCs w:val="18"/>
               </w:rPr>
-              <w:t xml:space="preserve">0</w:t>
+              <w:t xml:space="preserve">4</w:t>
             </w:r>
           </w:p>
         </w:tc>
@@ -2216,7 +2216,7 @@
                 <w:sz w:val="18"/>
                 <w:szCs w:val="18"/>
               </w:rPr>
-              <w:t xml:space="preserve">4</w:t>
+              <w:t xml:space="preserve">1</w:t>
             </w:r>
           </w:p>
         </w:tc>
@@ -2252,7 +2252,7 @@
                 <w:sz w:val="18"/>
                 <w:szCs w:val="18"/>
               </w:rPr>
-              <w:t xml:space="preserve">2</w:t>
+              <w:t xml:space="preserve">1</w:t>
             </w:r>
           </w:p>
         </w:tc>
@@ -2473,7 +2473,7 @@
                 <w:sz w:val="18"/>
                 <w:szCs w:val="18"/>
               </w:rPr>
-              <w:t xml:space="preserve">2</w:t>
+              <w:t xml:space="preserve">8</w:t>
             </w:r>
           </w:p>
         </w:tc>
@@ -2509,7 +2509,7 @@
                 <w:sz w:val="18"/>
                 <w:szCs w:val="18"/>
               </w:rPr>
-              <w:t xml:space="preserve">14</w:t>
+              <w:t xml:space="preserve">8</w:t>
             </w:r>
           </w:p>
         </w:tc>
@@ -2580,7 +2580,7 @@
           <w:sz w:val="21"/>
           <w:szCs w:val="21"/>
         </w:rPr>
-        <w:t xml:space="preserve">A learner who guessed every item blind would average 6.5 of 39, since a written answer cannot be guessed from a list, and fewer than one guesser in twenty would reach 11. A score of 10 or below is therefore within reach of guessing alone, and the tally reads such a paper as a conversation to have on Monday, never as a result.</w:t>
+        <w:t xml:space="preserve">A learner who guessed every item blind would average 6.4 of 39, since a written answer cannot be guessed from a list, and fewer than one guesser in twenty would reach 11. A score of 10 or below is therefore within reach of guessing alone, and the tally reads such a paper as a conversation to have on Monday, never as a result.</w:t>
       </w:r>
     </w:p>
     <w:p>
@@ -3716,7 +3716,7 @@
                 <w:sz w:val="18"/>
                 <w:szCs w:val="18"/>
               </w:rPr>
-              <w:t xml:space="preserve">Medium</w:t>
+              <w:t xml:space="preserve">Easy</w:t>
             </w:r>
           </w:p>
         </w:tc>
@@ -5462,7 +5462,7 @@
                 <w:sz w:val="18"/>
                 <w:szCs w:val="18"/>
               </w:rPr>
-              <w:t xml:space="preserve">Medium</w:t>
+              <w:t xml:space="preserve">Hard</w:t>
             </w:r>
           </w:p>
         </w:tc>
@@ -6044,7 +6044,7 @@
                 <w:sz w:val="18"/>
                 <w:szCs w:val="18"/>
               </w:rPr>
-              <w:t xml:space="preserve">Medium</w:t>
+              <w:t xml:space="preserve">Easy</w:t>
             </w:r>
           </w:p>
         </w:tc>
@@ -12737,7 +12737,7 @@
                 <w:sz w:val="18"/>
                 <w:szCs w:val="18"/>
               </w:rPr>
-              <w:t xml:space="preserve">Hard</w:t>
+              <w:t xml:space="preserve">Medium</w:t>
             </w:r>
           </w:p>
         </w:tc>
@@ -13028,7 +13028,7 @@
                 <w:sz w:val="18"/>
                 <w:szCs w:val="18"/>
               </w:rPr>
-              <w:t xml:space="preserve">Medium</w:t>
+              <w:t xml:space="preserve">Easy</w:t>
             </w:r>
           </w:p>
         </w:tc>
@@ -13319,7 +13319,7 @@
                 <w:sz w:val="18"/>
                 <w:szCs w:val="18"/>
               </w:rPr>
-              <w:t xml:space="preserve">Medium</w:t>
+              <w:t xml:space="preserve">Easy</w:t>
             </w:r>
           </w:p>
         </w:tc>
@@ -13610,7 +13610,7 @@
                 <w:sz w:val="18"/>
                 <w:szCs w:val="18"/>
               </w:rPr>
-              <w:t xml:space="preserve">Medium</w:t>
+              <w:t xml:space="preserve">Easy</w:t>
             </w:r>
           </w:p>
         </w:tc>
@@ -13901,7 +13901,7 @@
                 <w:sz w:val="18"/>
                 <w:szCs w:val="18"/>
               </w:rPr>
-              <w:t xml:space="preserve">Medium</w:t>
+              <w:t xml:space="preserve">Easy</w:t>
             </w:r>
           </w:p>
         </w:tc>
@@ -14567,7 +14567,7 @@
                 <w:sz w:val="21"/>
                 <w:szCs w:val="21"/>
               </w:rPr>
-              <w:t xml:space="preserve">A complete definition names its numerator, its denominator, its window and its exclusions, and the window is the period counted, which decides what a before-and-after comparison holds. Kalpa's growth-plan comparison started on 20 August because the monsoon sale ended on 19 August, so the sale's extra orders sat in neither window. A baseline is what a number is compared with, and a target is what the plan hopes it reaches; neither is part of the definition. The plural words in the bank do not fit the singular blank.</w:t>
+              <w:t xml:space="preserve">A complete definition names its numerator, its denominator, its window and its exclusions, and the window is the period counted, which decides what a before-and-after comparison holds. Kalpa's growth-plan comparison started on 20 August because the monsoon sale ended on 19 August, so the sale's extra orders sat in neither window. A baseline is what a number is compared with, and a target is what the plan hopes it reaches; neither is part of the definition. Guardrails sit beside a definition as numbers of their own, and each word in the bank is used once, so guardrails belongs to Q1.</w:t>
             </w:r>
           </w:p>
           <w:p>
@@ -14689,7 +14689,7 @@
                 <w:sz w:val="18"/>
                 <w:szCs w:val="18"/>
               </w:rPr>
-              <w:t xml:space="preserve">   True or false, Medium, [F], Mon</w:t>
+              <w:t xml:space="preserve">   True or false, Easy, [F], Mon</w:t>
             </w:r>
           </w:p>
           <w:p>
@@ -14715,7 +14715,7 @@
                 <w:sz w:val="21"/>
                 <w:szCs w:val="21"/>
               </w:rPr>
-              <w:t xml:space="preserve">False. A leading indicator moves before the north star, while a team can still act on it; a lagging number confirms later. Rider requests per peak online hour, by zone, say where riders are waiting before the week's completed trips are counted, so the city can send drivers there. It fell from 2.13 to 1.75 because the new online hours went where riders were few, while the north star barely moved, from 35.76 to 35.89 trips per online driver-week.</w:t>
+              <w:t xml:space="preserve">False. A leading indicator moves before the north star, while a team can still act on it; a lagging number confirms later. Rider requests per peak online hour, by zone, say where riders are waiting before the week's completed trips are counted, so the city can send drivers there. It fell from 2.13 to 1.75 because the new online hours went where riders were few, while the north star barely moved, from 35.76 to 35.89 trips per online driver-week (Monday's case data).</w:t>
             </w:r>
           </w:p>
           <w:p>
@@ -15025,7 +15025,7 @@
                 <w:sz w:val="20"/>
                 <w:szCs w:val="20"/>
               </w:rPr>
-              <w:t xml:space="preserve">1.31 is the average of each driver's own rate, which gives a 10-hour week and a 16-hour week the same weight; the city's rate is all trips over all hours, and both fell.</w:t>
+              <w:t xml:space="preserve">1.31 is the average of each driver's own rate, which gives a 10-hour week and a 16-hour week the same weight; the city's rate is all trips over all hours, and both fell. A higher floor per online hour pays more for the same idle hours, the thing the rows show going wrong.</w:t>
             </w:r>
           </w:p>
           <w:p>
@@ -15173,7 +15173,7 @@
                 <w:sz w:val="21"/>
                 <w:szCs w:val="21"/>
               </w:rPr>
-              <w:t xml:space="preserve">True. Staff measured on the cross-sell count changed what they did to move it, in ways the bank never meant: accounts customers had not asked for, money moved in so a new account counted as funded, and contact details changed so surveys missed the customers (SEC order, Release 34-88257, checked 13 October 2026). The same thing happened on a smaller scale in Hyderabad, where 180 drivers took their peak online hours to 2.1 times while their trips fell 12 percent. The 2016 penalties, the CFPB's USD 100 million with the OCC's USD 35 million and Los Angeles's USD 50 million, came to USD 185 million (the CFPB's release of 8 September 2016, checked 13 October 2026), and the 2020 settlement with the SEC and the Justice Department to USD 3 billion.</w:t>
+              <w:t xml:space="preserve">True. Staff measured on the cross-sell count changed what they did to move it, in ways the bank never meant: accounts customers had not asked for, money moved in so a new account counted as funded, and contact details changed so surveys missed the customers (SEC order, Release 34-88257, checked 13 October 2026). The same thing happened on a smaller scale in Hyderabad, where 180 drivers took their peak online hours to 2.1 times while their trips fell 12 percent. The 2016 penalties, the CFPB's USD 100 million with the OCC's USD 35 million and Los Angeles's USD 50 million, came to USD 185 million between them by our sum (the CFPB's release of 8 September 2016, checked 13 October 2026), and the 2020 settlement with the SEC and the Justice Department to USD 3 billion.</w:t>
             </w:r>
           </w:p>
           <w:p>
@@ -15456,7 +15456,7 @@
                 <w:sz w:val="20"/>
                 <w:szCs w:val="20"/>
               </w:rPr>
-              <w:t xml:space="preserve">0.04 is a change in the ratio, and its share of the 0.11 rise is 36 percent; the window decides the period counted and cannot show a new kind of account joining the count.</w:t>
+              <w:t xml:space="preserve">The share is right; the window decides the period counted, and a shorter one counts the new accounts sooner without ever saying they are a new kind of account.</w:t>
             </w:r>
           </w:p>
           <w:p>
@@ -15833,7 +15833,7 @@
                 <w:sz w:val="21"/>
                 <w:szCs w:val="21"/>
               </w:rPr>
-              <w:t xml:space="preserve">A one-slide answer runs claim, evidence, caveat, action: the title states the claim a reader could act on from the title alone, one number with its denominator carries it, the caveat sits in plain sight, and the action names its cost and who signs. The topic title (e) gives the reader nothing to act on, and "peak online hours up 24 percent" (f) is Monday's trap resold, the number that looked like success while trips per online hour fell from 1.90 to 1.58.</w:t>
+              <w:t xml:space="preserve">A one-slide answer runs claim, evidence, caveat, action: the title states the claim a reader could act on from the title alone, one number with its denominator carries it, the caveat sits in plain sight, and the action names its cost and who signs. The topic title (e) gives the reader nothing to act on, and "peak online hours up 24 percent" (f) is Monday's trap resold, the number that looked like success while trips per online hour fell from 1.90 to 1.58. The second claim title (g) rests on the flattering denominator: bookings per active driver-week rose 0.8 percent, Rs 5,817 to Rs 5,861, only because each driver-week carried about four more online hours while each hour earned Rs 260 against Rs 314. The order is Tuesday's template, the Week 1 four-part note on one slide; the action closes the slide because its six-week test answers the caveat above it.</w:t>
             </w:r>
           </w:p>
           <w:p>
@@ -15955,7 +15955,7 @@
                 <w:sz w:val="18"/>
                 <w:szCs w:val="18"/>
               </w:rPr>
-              <w:t xml:space="preserve">   More than one correct, Medium, [F], Tue</w:t>
+              <w:t xml:space="preserve">   More than one correct, Hard, [F], Tue</w:t>
             </w:r>
           </w:p>
           <w:p>
@@ -16291,7 +16291,7 @@
                 <w:sz w:val="20"/>
                 <w:szCs w:val="20"/>
               </w:rPr>
-              <w:t xml:space="preserve">Conceding everything drops a claim the evidence supports, and the scheme keeps paying for another six weeks while the room waits for a year of data.</w:t>
+              <w:t xml:space="preserve">The concession is right and the evidence is wrong: a steady fare says each trip earned the same, and it cannot say whether the season cut the trips an hour carries, which is the finance partner's point; the requests and the trips per hour answer it.</w:t>
             </w:r>
           </w:p>
           <w:p>
@@ -16413,7 +16413,7 @@
                 <w:sz w:val="18"/>
                 <w:szCs w:val="18"/>
               </w:rPr>
-              <w:t xml:space="preserve">   True or false, Medium, [F], Tue</w:t>
+              <w:t xml:space="preserve">   True or false, Easy, [F], Tue</w:t>
             </w:r>
           </w:p>
           <w:p>
@@ -16439,7 +16439,7 @@
                 <w:sz w:val="21"/>
                 <w:szCs w:val="21"/>
               </w:rPr>
-              <w:t xml:space="preserve">False. The ask is one slide, five minutes, at Thursday's review, and the letter itself says a great memo probably takes a week or more (Amazon's 2017 letter to shareholders, filed 18 April 2018, checked 13 October 2026). The memo's lesson carries to the slide: every element must earn its place the way a sentence does in a memo. The afternoon's written case was the memo form of the same answer, for a reader with the time to read it.</w:t>
+              <w:t xml:space="preserve">False. The ask is one slide, five minutes, at Thursday's review, and the letter's own key point is that a great memo probably should take a week or more (Amazon's 2017 letter to shareholders, filed 18 April 2018, checked 13 October 2026). A memo serves a reader with an hour and a writer with a week; the city head asked for five minutes. The afternoon's written case was the memo form of the same answer, for a reader with the time to read it.</w:t>
             </w:r>
           </w:p>
           <w:p>
@@ -16546,7 +16546,7 @@
                 <w:sz w:val="21"/>
                 <w:szCs w:val="21"/>
               </w:rPr>
-              <w:t xml:space="preserve">I choose the form the decision-maker asked for and make every element earn its place; the memo is for the reader who has an hour and a week to write for.</w:t>
+              <w:t xml:space="preserve">I choose the form the decision-maker asked for: a slide for five minutes, and a memo for the reader who has an hour, written by someone who has a week.</w:t>
             </w:r>
           </w:p>
           <w:p>
@@ -16668,7 +16668,7 @@
                 <w:sz w:val="21"/>
                 <w:szCs w:val="21"/>
               </w:rPr>
-              <w:t xml:space="preserve">Clarify (b), map (d), calculate (e), validate (a): the dojo's four steps. The chain's numbers are assumptions said aloud: about 1 crore people, 1 weekday Uber trip for every 100 people, a quarter of the day's trips in the three evening hours, 2.4 trips an hour for a busy driver and about 30 percent of online drivers idle at a moment, so 1.68 trips per online driver-hour, and a buffer of 1.15. The check compares like with like, online driver-hours per completed trip, 0.60 in the chain against the case's 0.53, so the chain runs about an eighth high and the checked answer is about 5,000 to 5,700. Step c divides a day's trips by an hour's rate, a day treated as an hour, which is why it spoils the estimate.</w:t>
+              <w:t xml:space="preserve">Clarify (b), map (d), calculate (e), validate (a): the dojo's four steps. The chain's numbers are assumptions said aloud: about 1 crore people, 1 weekday Uber trip for every 100 people, a quarter of the day's trips in the three evening hours, 2.4 trips an hour for a busy driver and about 30 percent of online drivers idle at a moment, so 1.68 trips per online driver-hour, and a buffer of 1.15. The check compares like with like, online driver-hours per completed trip, 0.60 in the chain against the case's 0.53, so the chain runs about an eighth high and the checked answer is about 5,000 to 5,700. Step c checks in the wrong unit: 8,333 trips an hour over 2.13 rider requests per online hour, about 3,900, divides trips served by riders asking, and requests ran above trips (251,910 against 224,200 before the launch), so it moves the answer the wrong way.</w:t>
             </w:r>
           </w:p>
           <w:p>
@@ -16816,7 +16816,7 @@
                 <w:sz w:val="21"/>
                 <w:szCs w:val="21"/>
               </w:rPr>
-              <w:t xml:space="preserve">Two hold. NPCI's 24.07 billion for September 2026, over that month's 30 days, is the 802 million a day Outlook Money reported (2 October 2026, checked 13 October 2026), and a per-day estimate is compared per day. DMart's revenue spread over the stores open across the year, the average of 415 and 500, gives about Rs 146 crore a store (Avenue Supermarts, 2 May 2026, checked 13 October 2026); a first-year store sells less than that, which is why DMart reports two-year-old stores separately. Flipkart's own text says 6.3 million concurrent users in a minute; the 63 is in its web address. Households are people divided by about four, 20 lakh over 4 is 5 lakh, so eight million households is people multiplied.</w:t>
+              <w:t xml:space="preserve">Two hold. NPCI's 24.07 billion for September 2026, over that month's 30 days, is the 802 million a day Outlook Money reported (2 October 2026, checked 13 October 2026), and a per-day estimate is compared per day. DMart's revenue spread over the stores open across the year, the average of 415 and 500, gives about Rs 146 crore a store (Avenue Supermarts, 2 May 2026, checked 13 October 2026). It is a rough check: 58 of the 85 new stores opened in the last quarter, so with openings spread evenly the year held about 439 store-years, about Rs 152 crore each, and a first-year estimate sits below either figure. Flipkart's own text says 6.3 million concurrent users in a minute; the 63 is in its web address. Households are people divided by about four, 20 lakh over 4 is 5 lakh, so eight million households is people multiplied.</w:t>
             </w:r>
           </w:p>
           <w:p>
@@ -16871,6 +16871,33 @@
                 <w:szCs w:val="20"/>
               </w:rPr>
               <w:t xml:space="preserve">Households can never outnumber people; at four to a household, two million people make about 5 lakh households.</w:t>
+            </w:r>
+          </w:p>
+          <w:p>
+            <w:pPr>
+              <w:keepNext/>
+              <w:spacing w:after="40" w:line="264"/>
+              <w:ind w:left="360" w:hanging="360"/>
+            </w:pPr>
+            <w:r>
+              <w:rPr>
+                <w:rFonts w:ascii="Arial" w:cs="Arial" w:eastAsia="Arial" w:hAnsi="Arial"/>
+                <w:b/>
+                <w:bCs/>
+                <w:color w:val="1C1B16"/>
+                <w:sz w:val="20"/>
+                <w:szCs w:val="20"/>
+              </w:rPr>
+              <w:t xml:space="preserve">E.  </w:t>
+            </w:r>
+            <w:r>
+              <w:rPr>
+                <w:rFonts w:ascii="Arial" w:cs="Arial" w:eastAsia="Arial" w:hAnsi="Arial"/>
+                <w:color w:val="1C1B16"/>
+                <w:sz w:val="20"/>
+                <w:szCs w:val="20"/>
+              </w:rPr>
+              <w:t xml:space="preserve">The unit matches and the period does not: 802 million is September's average day, and a festival day's payments are a different period, so the check would pull a sound Diwali-day estimate down toward an ordinary day.</w:t>
             </w:r>
           </w:p>
           <w:p>
@@ -18001,7 +18028,7 @@
                 <w:sz w:val="21"/>
                 <w:szCs w:val="21"/>
               </w:rPr>
-              <w:t xml:space="preserve">A lift of 0.97 means case buyers take a charger slightly less often than shoppers in general, so a bundle would pay a discount on chargers the case buyers were buying anyway and sell no extra one. The confidence of 0.825 looks strong only because the charger is in 85 percent of all baskets. The lab's three lines for merchandising were the same call on Kalpa's real counts: refuse the charger bundle, promote the wireless earphones with their case (lift 3.1 at a support of 6 percent, 49 baskets, three-quarters of them Retail-Plus) and watch the car pair.</w:t>
+              <w:t xml:space="preserve">A lift of 0.97 means case buyers take a charger slightly less often than shoppers in general, so a bundle would pay a discount on chargers the case buyers were buying anyway and sell no extra one. The confidence of 0.825 looks strong only because the charger is in 85 percent of all baskets. The lab's three lines for merchandising were the same call on the lab's own counts: refuse the charger bundle, promote the wireless earphones with their case (lift 3.1 at a support of 6 percent, 49 baskets, three-quarters of them Retail-Plus) and watch the car pair.</w:t>
             </w:r>
           </w:p>
           <w:p>
@@ -19065,7 +19092,7 @@
                 <w:sz w:val="20"/>
                 <w:szCs w:val="20"/>
               </w:rPr>
-              <w:t xml:space="preserve">The blend is consistent: it is the sizes times the rates, and 1,640 over 4,000 and 2,460 over 6,000 are both 41 percent.</w:t>
+              <w:t xml:space="preserve">Cohort C's 47.5 percent is its first month and cohort A's 50 percent in May is A at an older age, so the comparison sets two ages side by side; read at the same age, A and B fell and C propped the blend.</w:t>
             </w:r>
           </w:p>
           <w:p>
@@ -19294,7 +19321,7 @@
                 <w:sz w:val="20"/>
                 <w:szCs w:val="20"/>
               </w:rPr>
-              <w:t xml:space="preserve">The carousel opens menus with no search, so more menu views than searches is the flow itself; the order records match the event log, 27,212 member orders in September.</w:t>
+              <w:t xml:space="preserve">The carousel opens menus with no search, so more menu views than searches is the flow itself; the order records match the event log, 27,212 member orders in September (Thursday's case data).</w:t>
             </w:r>
           </w:p>
           <w:p>
@@ -19442,7 +19469,7 @@
                 <w:sz w:val="21"/>
                 <w:szCs w:val="21"/>
               </w:rPr>
-              <w:t xml:space="preserve">The fall sits in one step for one group: completing a started checkout, for Android members, from the release date, while iOS members and non-members on the same new checkout held, so the break is in what only members see, such as the free-delivery line or the membership check at payment. The size: 14 points of 22,841 carts is about 3,198 orders over 17 days, and 7 days of 17 is about 1,317 a week, Rs 4.0 lakh at Rs 300 and Rs 6.6 lakh at Rs 500. Fixing it ends a weekly loss, which is why it goes before the sale cohort's question.</w:t>
+              <w:t xml:space="preserve">The fall sits in one step for one group: completing a started checkout, for Android members, from the release date, while iOS members and non-members on the same new checkout held, so the break is in what only members see, such as the free-delivery line or the membership check at payment. The size: 14 points of 22,841 carts is about 3,198 orders over 17 days, and 7 days of 17 is about 1,317 a week, Rs 4.0 lakh at Rs 300 and Rs 6.6 lakh at Rs 500. With iOS members as the comparator, the fall that belongs to the release is 13 points, about 1,223 orders a week; the option's 1,317 is against the members' own old rate, as it says, and no option offers the comparator figure. Fixing it ends a weekly loss, which is why it goes before the sale cohort's question.</w:t>
             </w:r>
           </w:p>
           <w:p>
@@ -19496,7 +19523,7 @@
                 <w:sz w:val="20"/>
                 <w:szCs w:val="20"/>
               </w:rPr>
-              <w:t xml:space="preserve">Non-members on Android went from 52 to 51 percent on the same checkout, so the fault is in the member path, and rolling back everyone's checkout loses what non-members kept.</w:t>
+              <w:t xml:space="preserve">The number is the members' loss and the diagnosis is wrong: non-members on Android went from 52 to 51 percent on the same checkout, so the fault is in the member path, and rolling back everyone's checkout loses what non-members kept.</w:t>
             </w:r>
           </w:p>
           <w:p>
@@ -19698,7 +19725,7 @@
                 <w:sz w:val="20"/>
                 <w:szCs w:val="20"/>
               </w:rPr>
-              <w:t xml:space="preserve">On the base of users who joined, the five weaned users stay in the denominator, so the cell reads 40 percent; only the base of users who stayed reads 80.</w:t>
+              <w:t xml:space="preserve">The numbers are right and the question is not: before a cohort chart's shape is read, it has to say what it divides by and what it counts; the acquisition quarter is a second question and explains nothing about a cell that rose with nobody's behaviour changing.</w:t>
             </w:r>
           </w:p>
           <w:p>
@@ -19954,7 +19981,7 @@
                 <w:sz w:val="20"/>
                 <w:szCs w:val="20"/>
               </w:rPr>
-              <w:t xml:space="preserve">The window's carts came from members of every cohort, and the fall sits in one step inside one window; a cohort's weakness is a different question.</w:t>
+              <w:t xml:space="preserve">The blend cannot see a step inside a session, so its flat 41 percent says nothing about the checkout in either direction; the evidence is the step's conversion by date, with its counts.</w:t>
             </w:r>
           </w:p>
           <w:p>
@@ -20277,7 +20304,7 @@
                 <w:sz w:val="21"/>
                 <w:szCs w:val="21"/>
               </w:rPr>
-              <w:t xml:space="preserve">The seasonal naive copies the same month a year earlier: October 2026 gets October 2025's Rs 427.6 lakh and November gets Rs 297.0 lakh, so it puts the spike in October. Diwali fell in October in 2024 and 2025 and falls on 8 November 2026, so the copy carries a festival month into a month with no festival. The festival-aligned copy gives November 2026, Diwali's month, last year's Diwali month: Rs 427.6 lakh times 1.04, about Rs 444.7 lakh. Accept the three numbers to the nearest lakh with November named. Friday's lab built the rest of the winter the same way, swapping last year's October and November, so October 2026 reads Rs 297.0 lakh times 1.04, about Rs 308.8 lakh; a learner who adds it has gone further than the item asks. Both Octobers in the exhibit are about 1.44 times their November, which is the festival.</w:t>
+              <w:t xml:space="preserve">The seasonal naive copies the same month a year earlier: October 2026 gets October 2025's Rs 427.6 lakh and November gets Rs 297.0 lakh, so it puts the spike in October. Diwali fell in October in 2024 and 2025 and falls on 8 November 2026, so the copy carries a festival month into a month with no festival. The baseline that puts the festival in its own month is the festival-aligned copy: November 2026, Diwali's month, gets last year's Diwali month, Rs 427.6 lakh times 1.04, about Rs 444.7 lakh. Accept the three numbers to the nearest lakh with November named. November 2024, straight after a Diwali on 31 October, shows no lift, so the festival's lift sits in its run-up; an answer that gives November the Diwali week and says part of the run-up may land in late October 2026 has gone further and is right. Friday's lab built the rest of the winter the same way, swapping last year's October and November, so October 2026 reads Rs 297.0 lakh times 1.04, about Rs 309 lakh on the printed figure. Both Octobers in the exhibit are about 1.44 times their November, which is the festival.</w:t>
             </w:r>
           </w:p>
           <w:p>
@@ -20479,7 +20506,7 @@
                 <w:sz w:val="20"/>
                 <w:szCs w:val="20"/>
               </w:rPr>
-              <w:t xml:space="preserve">A curve tuned to its own past can fit within 2 percent and miss the next weeks widely; the vendor's missed by 16,400 a week.</w:t>
+              <w:t xml:space="preserve">The hidden weeks are the right test and the bar is wrong: a curve's own fit is no baseline; it has to beat the seasonal naive on the same weeks, and the vendor's 16,400 a week against the copy's 9,831 did not.</w:t>
             </w:r>
           </w:p>
           <w:p>
@@ -21086,7 +21113,7 @@
                 <w:sz w:val="18"/>
                 <w:szCs w:val="18"/>
               </w:rPr>
-              <w:t xml:space="preserve">   More than one correct, Hard, [D], Sat</w:t>
+              <w:t xml:space="preserve">   More than one correct, Medium, [D], Sat</w:t>
             </w:r>
           </w:p>
           <w:p>
@@ -21261,7 +21288,7 @@
                 <w:sz w:val="18"/>
                 <w:szCs w:val="18"/>
               </w:rPr>
-              <w:t xml:space="preserve">   Match the following, Medium, [D], Sat</w:t>
+              <w:t xml:space="preserve">   Match the following, Easy, [D], Sat</w:t>
             </w:r>
           </w:p>
           <w:p>
@@ -21287,7 +21314,7 @@
                 <w:sz w:val="21"/>
                 <w:szCs w:val="21"/>
               </w:rPr>
-              <w:t xml:space="preserve">The rate's window ends at a promised date the measured dispatchers can move, the way the Phoenix VA's wait times ran from a "desired date" that 30 of 79 schedulers interviewed said they entered wrongly (VA Office of Inspector General, report 14-02603-267, 26 August 2014, checked 13 October 2026); the fix fixes the promise when the order is placed and guards it with the share of promises moved. What changed from Uber: the people who move the number are dispatchers, and the cost of an error is a customer told a parcel was on time when it was not.</w:t>
+              <w:t xml:space="preserve">The rate's window ends at a promised date the measured dispatchers can move, the way the Phoenix VA's wait times ran from a "desired date" that 30 of the 79 scheduling staff interviewed said they entered wrongly (VA Office of Inspector General, report 14-02603-267, 26 August 2014, checked 13 October 2026); the fix fixes the promise when the order is placed and guards it with the share of promises moved. What changed from Uber: the people who move the number are dispatchers, and the cost of an error is a customer told a parcel was on time when it was not.</w:t>
             </w:r>
           </w:p>
           <w:p>
@@ -21409,7 +21436,7 @@
                 <w:sz w:val="18"/>
                 <w:szCs w:val="18"/>
               </w:rPr>
-              <w:t xml:space="preserve">   Match the following, Medium, [D], Sat</w:t>
+              <w:t xml:space="preserve">   Match the following, Easy, [D], Sat</w:t>
             </w:r>
           </w:p>
           <w:p>
@@ -21557,7 +21584,7 @@
                 <w:sz w:val="18"/>
                 <w:szCs w:val="18"/>
               </w:rPr>
-              <w:t xml:space="preserve">   Match the following, Medium, [D], Sat</w:t>
+              <w:t xml:space="preserve">   Match the following, Easy, [D], Sat</w:t>
             </w:r>
           </w:p>
           <w:p>
@@ -21705,7 +21732,7 @@
                 <w:sz w:val="18"/>
                 <w:szCs w:val="18"/>
               </w:rPr>
-              <w:t xml:space="preserve">   Match the following, Medium, [D], Sat</w:t>
+              <w:t xml:space="preserve">   Match the following, Easy, [D], Sat</w:t>
             </w:r>
           </w:p>
           <w:p>
@@ -22122,7 +22149,7 @@
           <w:sz w:val="21"/>
           <w:szCs w:val="21"/>
         </w:rPr>
-        <w:t xml:space="preserve">Easy (2): Q1, Q29</w:t>
+        <w:t xml:space="preserve">Easy (8): Q1, Q3, Q11, Q29, Q35, Q36, Q37, Q38</w:t>
       </w:r>
     </w:p>
     <w:p>
@@ -22141,7 +22168,7 @@
           <w:sz w:val="21"/>
           <w:szCs w:val="21"/>
         </w:rPr>
-        <w:t xml:space="preserve">Medium (14): Q2, Q3, Q5, Q9, Q11, Q17, Q18, Q19, Q22, Q23, Q35, Q36, Q37, Q38</w:t>
+        <w:t xml:space="preserve">Medium (8): Q2, Q5, Q17, Q18, Q19, Q22, Q23, Q34</w:t>
       </w:r>
     </w:p>
     <w:p>
@@ -22160,7 +22187,7 @@
           <w:sz w:val="21"/>
           <w:szCs w:val="21"/>
         </w:rPr>
-        <w:t xml:space="preserve">Hard (23): Q4, Q6, Q7, Q8, Q10, Q12, Q13, Q14, Q15, Q16, Q20, Q21, Q24, Q25, Q26, Q27, Q28, Q30, Q31, Q32, Q33, Q34, Q39</w:t>
+        <w:t xml:space="preserve">Hard (23): Q4, Q6, Q7, Q8, Q9, Q10, Q12, Q13, Q14, Q15, Q16, Q20, Q21, Q24, Q25, Q26, Q27, Q28, Q30, Q31, Q32, Q33, Q39</w:t>
       </w:r>
     </w:p>
     <w:p>
@@ -22325,7 +22352,7 @@
           <w:sz w:val="21"/>
           <w:szCs w:val="21"/>
         </w:rPr>
-        <w:t xml:space="preserve">Q3 (True or false, Medium, [F]): The city team's dashboard puts rider requests per peak online hour, zone by zone, beside its north star, completed peak trips per enrolled driver online at peak each week. Statement: a leading indicator moves after the north-star metric has already moved. True or false, and why?</w:t>
+        <w:t xml:space="preserve">Q3 (True or false, Easy, [F]): The city team's dashboard puts rider requests per peak online hour, zone by zone, beside its north star, completed peak trips per enrolled driver online at peak each week. Statement: a leading indicator moves after the north-star metric has already moved. True or false, and why?</w:t>
       </w:r>
     </w:p>
     <w:p>
@@ -22420,7 +22447,7 @@
           <w:sz w:val="21"/>
           <w:szCs w:val="21"/>
         </w:rPr>
-        <w:t xml:space="preserve">Q8 (Order the steps, Hard, [S]): Four of these six lines make the city head's slide, and two would spoil it. Leave those two out and write the other four in the order Tuesday's one-slide template puts them, from the top.</w:t>
+        <w:t xml:space="preserve">Q8 (Order the steps, Hard, [S]): Four of these seven lines make the city head's slide, and three would spoil it. Leave those three out and write the other four in the order Tuesday's one-slide template puts them, from the top.</w:t>
       </w:r>
     </w:p>
     <w:p>
@@ -22439,7 +22466,7 @@
           <w:sz w:val="21"/>
           <w:szCs w:val="21"/>
         </w:rPr>
-        <w:t xml:space="preserve">Q9 (More than one correct, Medium, [F]): A second draft argues that riders got little for the Rs 1.9 crore of top-up. Which two elements carry that claim? Mark both; every other element moves to an appendix page headed by the question a named role will ask.</w:t>
+        <w:t xml:space="preserve">Q9 (More than one correct, Hard, [F]): A second draft argues that riders got little for the Rs 1.9 crore of top-up. Which two elements carry that claim? Mark both; every other element moves to an appendix page headed by the question a named role will ask.</w:t>
       </w:r>
     </w:p>
     <w:p>
@@ -22477,7 +22504,7 @@
           <w:sz w:val="21"/>
           <w:szCs w:val="21"/>
         </w:rPr>
-        <w:t xml:space="preserve">Q11 (True or false, Medium, [F]): A colleague cites Amazon's 2017 letter to shareholders, which says Amazon's meetings start with a six-page memo read in silence, use no slides, and that a great memo probably takes a week or more to write. Statement: the city head's Thursday review should get a memo in place of the one slide. True or false, and why?</w:t>
+        <w:t xml:space="preserve">Q11 (True or false, Easy, [F]): A colleague cites Amazon's 2017 letter to shareholders, which says Amazon's meetings start with a six-page memo read in silence, use no slides, and that a great memo probably takes a week or more to write. Statement: the city head's Thursday review should get a memo in place of the one slide. True or false, and why?</w:t>
       </w:r>
     </w:p>
     <w:p>
@@ -22515,7 +22542,7 @@
           <w:sz w:val="21"/>
           <w:szCs w:val="21"/>
         </w:rPr>
-        <w:t xml:space="preserve">Q13 (More than one correct, Hard, [S]): Before the review, a colleague lines up four numbers to check estimates against: NPCI's UPI count as Outlook Money reported it, Flipkart Stories' post of 9 October 2026, Avenue Supermarts' FY26 release for DMart, and a city invented for a drill. Which checks are sound? Mark every correct option.</w:t>
+        <w:t xml:space="preserve">Q13 (More than one correct, Hard, [S]): Before the review, a colleague lines up five checks on four numbers: NPCI's UPI count as Outlook Money reported it, Flipkart Stories' post of 9 October 2026, Avenue Supermarts' FY26 release for DMart, and a city invented for a drill. Which checks are sound? Mark every correct option.</w:t>
       </w:r>
     </w:p>
     <w:p>
@@ -22591,7 +22618,7 @@
           <w:sz w:val="21"/>
           <w:szCs w:val="21"/>
         </w:rPr>
-        <w:t xml:space="preserve">Q20 (True or false, Hard, [F]): Statement: a pair with a lift of about 4 and a support of about 0.25 percent belongs on a watch list before it belongs in a campaign. Judge it on both pairs in Exhibit 3E. True or false, and why?</w:t>
+        <w:t xml:space="preserve">Q20 (True or false, Hard, [F]): Statement: a pair with a lift of about 4 and a support of about 0.25 percent belongs on a watch list, to be counted again or tested, before it belongs in a campaign. Judge it on both pairs in Exhibit 3E. True or false, and why?</w:t>
       </w:r>
     </w:p>
     <w:p>
@@ -22705,7 +22732,7 @@
           <w:sz w:val="21"/>
           <w:szCs w:val="21"/>
         </w:rPr>
-        <w:t xml:space="preserve">Q30 (Applied maths, Hard, [F]): Anand's board line needs October and November 2026. Using Exhibits 5A and 5B, give the seasonal naive for both months, then the festival-aligned copy, last year's Diwali month plus 4 percent, for the one 2026 month that holds Diwali, and say which month should carry the festival's spike.</w:t>
+        <w:t xml:space="preserve">Q30 (Applied maths, Hard, [F]): Anand's board line needs October and November 2026. Using Exhibits 5A and 5B, give the seasonal naive for both months, then a seasonal baseline with Friday's 4 percent growth that puts the festival in its own month, and say which month should carry the festival's spike.</w:t>
       </w:r>
     </w:p>
     <w:p>
@@ -22762,7 +22789,7 @@
           <w:sz w:val="21"/>
           <w:szCs w:val="21"/>
         </w:rPr>
-        <w:t xml:space="preserve">Q33 (One correct option, Hard, [D]): Anand asks which number goes in front of the board for October 2026 to March 2027, and how wrong it could be. Diwali falls on 8 November 2026. Using Exhibit 5E, which sentence answers him?</w:t>
+        <w:t xml:space="preserve">Q33 (One correct option, Hard, [D]): Anand asks which number goes in front of the board for October 2026 to March 2027, and how wrong it could be. Using Exhibits 5A and 5E, which sentence answers him?</w:t>
       </w:r>
     </w:p>
     <w:p>
@@ -22781,7 +22808,7 @@
           <w:sz w:val="21"/>
           <w:szCs w:val="21"/>
         </w:rPr>
-        <w:t xml:space="preserve">Q35 (Match the following, Medium, [D]): Kalpa Logistics' head of operations: the on-time delivery rate has risen since dispatchers were allowed to move a parcel's promised date once a delay was known.</w:t>
+        <w:t xml:space="preserve">Q35 (Match the following, Easy, [D]): Kalpa Logistics' head of operations: the on-time delivery rate has risen since dispatchers were allowed to move a parcel's promised date once a delay was known.</w:t>
       </w:r>
     </w:p>
     <w:p>
@@ -22800,7 +22827,7 @@
           <w:sz w:val="21"/>
           <w:szCs w:val="21"/>
         </w:rPr>
-        <w:t xml:space="preserve">Q36 (Match the following, Medium, [D]): Dr Priya Menon: which step between a test booked and a visit completed loses the most dollars, metro area by metro area?</w:t>
+        <w:t xml:space="preserve">Q36 (Match the following, Easy, [D]): Dr Priya Menon: which step between a test booked and a visit completed loses the most dollars, metro area by metro area?</w:t>
       </w:r>
     </w:p>
     <w:p>
@@ -22819,7 +22846,7 @@
           <w:sz w:val="21"/>
           <w:szCs w:val="21"/>
         </w:rPr>
-        <w:t xml:space="preserve">Q37 (Match the following, Medium, [D]): Ananya Bose: blended monthly churn has held steady for four months while subscribers who joined since the spring seem to cancel sooner.</w:t>
+        <w:t xml:space="preserve">Q37 (Match the following, Easy, [D]): Ananya Bose: blended monthly churn has held steady for four months while subscribers who joined since the spring seem to cancel sooner.</w:t>
       </w:r>
     </w:p>
     <w:p>
@@ -22838,7 +22865,7 @@
           <w:sz w:val="21"/>
           <w:szCs w:val="21"/>
         </w:rPr>
-        <w:t xml:space="preserve">Q38 (Match the following, Medium, [D]): Rohan Desai: which second product should a customer be offered first, beyond what any customer takes up anyway?</w:t>
+        <w:t xml:space="preserve">Q38 (Match the following, Easy, [D]): Rohan Desai: which second product should a customer be offered first, beyond what any customer takes up anyway?</w:t>
       </w:r>
     </w:p>
     <w:p>
@@ -25904,7 +25931,6 @@
                     <w:bottom w:val="single" w:color="D5D0C4" w:sz="4"/>
                     <w:right w:val="single" w:color="D5D0C4" w:sz="4"/>
                   </w:tcBorders>
-                  <w:shd w:fill="D5D0C4" w:color="auto" w:val="clear"/>
                   <w:tcMar>
                     <w:top w:type="dxa" w:w="20"/>
                     <w:left w:type="dxa" w:w="60"/>

</xml_diff>

<commit_message>
W04 SAT: the blind sitting's fixes, and five items back to Medium on its read
Exhibit 5E no longer prints "not a forecast" beside the plan line, which now sits in Q33's stem,
and every Q33 option says its six months held no Diwali. Q6 asks for two additions to the written
definition, and its wrong exclusion drops the remittance accounts the 2013 row names. Q14's option
c names the 64 lakh it moves to, Q39's two halves run the same length, Exhibit 5D leaves the spare
shipment's cost for the room to divide, and Exhibit 2A's role label prints whole. The keys give the
hidden weeks' dates and Q10's floor. Q6, Q12, Q31, Q33 and Q39 are Medium, as the sitting read
them; the paper holds 9 easy, 17 medium and 13 hard items, and the proofs assert that shape.

Co-Authored-By: Claude Opus 5.5 <noreply@anthropic.com>
Claude-Session: https://claude.ai/code/session_01Xzgk1z5yvgqgEKKJve75mt
</commit_message>
<xml_diff>
--- a/content/W04/SAT/answer-key/C2_W04_SAT_answer_key_TRAINER.docx
+++ b/content/W04/SAT/answer-key/C2_W04_SAT_answer_key_TRAINER.docx
@@ -761,7 +761,7 @@
                 <w:sz w:val="18"/>
                 <w:szCs w:val="18"/>
               </w:rPr>
-              <w:t xml:space="preserve">1</w:t>
+              <w:t xml:space="preserve">2</w:t>
             </w:r>
           </w:p>
         </w:tc>
@@ -797,7 +797,7 @@
                 <w:sz w:val="18"/>
                 <w:szCs w:val="18"/>
               </w:rPr>
-              <w:t xml:space="preserve">3</w:t>
+              <w:t xml:space="preserve">2</w:t>
             </w:r>
           </w:p>
         </w:tc>
@@ -1052,7 +1052,7 @@
                 <w:sz w:val="18"/>
                 <w:szCs w:val="18"/>
               </w:rPr>
-              <w:t xml:space="preserve">1</w:t>
+              <w:t xml:space="preserve">2</w:t>
             </w:r>
           </w:p>
         </w:tc>
@@ -1088,7 +1088,7 @@
                 <w:sz w:val="18"/>
                 <w:szCs w:val="18"/>
               </w:rPr>
-              <w:t xml:space="preserve">5</w:t>
+              <w:t xml:space="preserve">4</w:t>
             </w:r>
           </w:p>
         </w:tc>
@@ -1925,7 +1925,7 @@
                 <w:sz w:val="18"/>
                 <w:szCs w:val="18"/>
               </w:rPr>
-              <w:t xml:space="preserve">0</w:t>
+              <w:t xml:space="preserve">2</w:t>
             </w:r>
           </w:p>
         </w:tc>
@@ -1961,7 +1961,7 @@
                 <w:sz w:val="18"/>
                 <w:szCs w:val="18"/>
               </w:rPr>
-              <w:t xml:space="preserve">4</w:t>
+              <w:t xml:space="preserve">2</w:t>
             </w:r>
           </w:p>
         </w:tc>
@@ -2216,7 +2216,7 @@
                 <w:sz w:val="18"/>
                 <w:szCs w:val="18"/>
               </w:rPr>
-              <w:t xml:space="preserve">1</w:t>
+              <w:t xml:space="preserve">2</w:t>
             </w:r>
           </w:p>
         </w:tc>
@@ -2252,7 +2252,7 @@
                 <w:sz w:val="18"/>
                 <w:szCs w:val="18"/>
               </w:rPr>
-              <w:t xml:space="preserve">1</w:t>
+              <w:t xml:space="preserve">0</w:t>
             </w:r>
           </w:p>
         </w:tc>
@@ -2509,7 +2509,7 @@
                 <w:sz w:val="18"/>
                 <w:szCs w:val="18"/>
               </w:rPr>
-              <w:t xml:space="preserve">12</w:t>
+              <w:t xml:space="preserve">17</w:t>
             </w:r>
           </w:p>
         </w:tc>
@@ -2545,7 +2545,7 @@
                 <w:sz w:val="18"/>
                 <w:szCs w:val="18"/>
               </w:rPr>
-              <w:t xml:space="preserve">18</w:t>
+              <w:t xml:space="preserve">13</w:t>
             </w:r>
           </w:p>
         </w:tc>
@@ -4589,7 +4589,7 @@
                 <w:sz w:val="18"/>
                 <w:szCs w:val="18"/>
               </w:rPr>
-              <w:t xml:space="preserve">Hard</w:t>
+              <w:t xml:space="preserve">Medium</w:t>
             </w:r>
           </w:p>
         </w:tc>
@@ -6335,7 +6335,7 @@
                 <w:sz w:val="18"/>
                 <w:szCs w:val="18"/>
               </w:rPr>
-              <w:t xml:space="preserve">Hard</w:t>
+              <w:t xml:space="preserve">Medium</w:t>
             </w:r>
           </w:p>
         </w:tc>
@@ -11864,7 +11864,7 @@
                 <w:sz w:val="18"/>
                 <w:szCs w:val="18"/>
               </w:rPr>
-              <w:t xml:space="preserve">Hard</w:t>
+              <w:t xml:space="preserve">Medium</w:t>
             </w:r>
           </w:p>
         </w:tc>
@@ -12446,7 +12446,7 @@
                 <w:sz w:val="18"/>
                 <w:szCs w:val="18"/>
               </w:rPr>
-              <w:t xml:space="preserve">Hard</w:t>
+              <w:t xml:space="preserve">Medium</w:t>
             </w:r>
           </w:p>
         </w:tc>
@@ -14192,7 +14192,7 @@
                 <w:sz w:val="18"/>
                 <w:szCs w:val="18"/>
               </w:rPr>
-              <w:t xml:space="preserve">Hard</w:t>
+              <w:t xml:space="preserve">Medium</w:t>
             </w:r>
           </w:p>
         </w:tc>
@@ -15200,7 +15200,7 @@
                 <w:sz w:val="20"/>
                 <w:szCs w:val="20"/>
               </w:rPr>
-              <w:t xml:space="preserve">The order describes the staff's behaviour moving with the target the bank paid on; a gap in the rules is what any target finds, which is the statement's point.</w:t>
+              <w:t xml:space="preserve">The order describes the staff's behaviour moving with the target staff were judged against; a gap in the rules is what any target finds, which is the statement's point.</w:t>
             </w:r>
           </w:p>
           <w:p>
@@ -15376,7 +15376,7 @@
                 <w:sz w:val="18"/>
                 <w:szCs w:val="18"/>
               </w:rPr>
-              <w:t xml:space="preserve">   One correct option, Hard, [F], Mon</w:t>
+              <w:t xml:space="preserve">   One correct option, Medium, [F], Mon</w:t>
             </w:r>
           </w:p>
           <w:p>
@@ -15402,7 +15402,7 @@
                 <w:sz w:val="21"/>
                 <w:szCs w:val="21"/>
               </w:rPr>
-              <w:t xml:space="preserve">Two different things raised the ratio in 2013, and each needs its own line. The 0.04, about 36 percent of the 0.11 rise, came from a change of what is counted: remittance accounts that already existed joined the count. The line that shows a change of definition is the dated change log, with the year of the change printed on both definitions, so a reader sees a step and never reads it as growth. A guardrail on revenue per household could not show it, since accounts that already existed had already earned their revenue, so nothing beside the ratio would move when they joined the count; a guardrail is a second number and keeps nothing out of the ratio itself. The rest of the rise came from more accounts and products inactive for at least 365 days (the SEC's order, Release 34-88257, paragraph 42, checked 13 October 2026), and the count carried no condition on use, so an unused debit card could stay in it for up to four years. An exclusion that drops any product unused for a year keeps that rest out. Dropping accounts closed during the year removes nothing, since a closed account already leaves the count and the inactive products were still open. The order says investors were never told of the 2013 addition, which is the breach the change log exists to prevent. Monday's deck teaches the four lines of a definition in the chapter on Definitions: numerator, denominator, window, exclusions, gaming in the chapter on Gaming, and definitions that resist it, and the page that carries both in the chapter on The metric definition artifact.</w:t>
+              <w:t xml:space="preserve">Two different things raised the ratio in 2013, and each needs its own addition. The 0.04, about 36 percent of the 0.11 rise, came from a change of what is counted: remittance accounts that already existed joined the count. The addition that shows a change of definition is a dated change log, with the year of the change printed on both definitions, so a reader sees a step and never reads it as growth; Monday's seven lines ask that each exclusion be dated if it changes, and the log keeps that date for every change to what is counted. A guardrail on revenue per household could not show it, since accounts that already existed had already earned their revenue, so nothing beside the ratio would move when they joined the count; a guardrail is a second number and keeps nothing out of the ratio itself. The rest of the rise came from more accounts and products inactive for at least 365 days (the SEC's order, Release 34-88257, paragraph 42, checked 13 October 2026), and the count carried no condition on use, so an unused debit card could stay in it for up to four years. An exclusion that drops any product unused for a year keeps that rest out. Dropping the remittance accounts added that year takes out the 0.04 the log exists to show and leaves the rest, the products unused for at least 365 days, in the ratio. The order says investors were never told of the 2013 addition, which is the breach the change log exists to prevent. Monday's deck teaches the four lines of a definition in the chapter on Definitions: numerator, denominator, window, exclusions, gaming in the chapter on Gaming, and definitions that resist it, and the page that carries both in the chapter on The metric definition artifact.</w:t>
             </w:r>
           </w:p>
           <w:p>
@@ -15456,7 +15456,7 @@
                 <w:sz w:val="20"/>
                 <w:szCs w:val="20"/>
               </w:rPr>
-              <w:t xml:space="preserve">A guardrail beside the ratio would not move when existing accounts joined the count, and a closed account already leaves it; neither line reaches the 0.04 or the inactive products.</w:t>
+              <w:t xml:space="preserve">A guardrail beside the ratio would not move when existing accounts joined the count, and dropping the remittance accounts takes out the 0.04 itself while the inactive products stay in.</w:t>
             </w:r>
           </w:p>
           <w:p>
@@ -15483,7 +15483,7 @@
                 <w:sz w:val="20"/>
                 <w:szCs w:val="20"/>
               </w:rPr>
-              <w:t xml:space="preserve">A closed account already leaves the count; the rest of the rise came from products still open and unused for at least 365 days, which only an exclusion on use drops.</w:t>
+              <w:t xml:space="preserve">The log shows the 0.04, and dropping the remittance accounts then takes that same 0.04 out, so the rest of the rise, products unused for at least 365 days, stays in the ratio.</w:t>
             </w:r>
           </w:p>
           <w:p>
@@ -16291,7 +16291,7 @@
                 <w:sz w:val="21"/>
                 <w:szCs w:val="21"/>
               </w:rPr>
-              <w:t xml:space="preserve">False. The defence has four moves: restate the objection until its owner agrees, answer from the evidence, concede what is true, and say what would change your mind. Finance is partly right, since the rains ended inside the six weeks and no weeks from last year are in the data, so the true part is conceded in the open. The evidence then has to answer the season where the season shows. Over the six weeks requests rose 1.8 percent, but on Exhibit 2B the first three weeks after the launch ran 43,507 to 43,878, above every week before it, and then requests fell four weeks running from 7 September; the six-week total hides that fall, so it cannot answer an objection that the season thinned demand. Even after the fall, the last three weeks ran 41,161 to 42,602, inside the 41,155 to 42,719 of the six weeks before, while trips per peak online hour held at 1.55 to 1.56 against 1.88 to 1.93: riders asked as often as before the launch and each online hour still carried fewer trips, which a thinner season cannot explain. What would change the analyst's mind is a city where the rains ended and no scheme launched, with trips per hour falling as far. Tuesday's deck teaches the four moves in the chapter on Defending under challenge: restate, answer, concede, what would change your mind, and Monday's deck the window a comparison is read over, in the chapter on Definitions: numerator, denominator, window, exclusions.</w:t>
+              <w:t xml:space="preserve">False. The defence has four moves: restate the objection until its owner agrees, answer from the evidence, concede what is true, and say what would change your mind. Finance is partly right, since the rains ended inside the six weeks and no weeks from last year are in the data, so the true part is conceded in the open. The evidence then has to answer the season where the season shows. Over the six weeks requests rose 1.8 percent, but on Exhibit 2B the first three weeks after the launch ran 43,507 to 43,878, above every week before it, and then requests fell four weeks running from 7 September; the six-week total hides that fall, so it cannot answer an objection that the season thinned demand. Even after the fall, the last three weeks ran 41,161 to 42,602, inside the 41,155 to 42,719 of the six weeks before; the lowest sits only 6 requests above that floor, so a learner who reads the last week as back at the floor of the old range has read it right. Through those weeks trips per peak online hour held at 1.55 to 1.56 against 1.88 to 1.93: riders asked as often as before the launch and each online hour still carried fewer trips, which a thinner season cannot explain. What would change the analyst's mind is a city where the rains ended and no scheme launched, with trips per hour falling as far. Tuesday's deck teaches the four moves in the chapter on Defending under challenge: restate, answer, concede, what would change your mind, and Monday's deck the window a comparison is read over, in the chapter on Definitions: numerator, denominator, window, exclusions.</w:t>
             </w:r>
           </w:p>
           <w:p>
@@ -16723,7 +16723,7 @@
                 <w:sz w:val="18"/>
                 <w:szCs w:val="18"/>
               </w:rPr>
-              <w:t xml:space="preserve">   Order the steps, Hard, [S], Tue</w:t>
+              <w:t xml:space="preserve">   Order the steps, Medium, [S], Tue</w:t>
             </w:r>
           </w:p>
           <w:p>
@@ -20561,7 +20561,7 @@
                 <w:sz w:val="18"/>
                 <w:szCs w:val="18"/>
               </w:rPr>
-              <w:t xml:space="preserve">   One correct option, Hard, [F], Fri</w:t>
+              <w:t xml:space="preserve">   One correct option, Medium, [F], Fri</w:t>
             </w:r>
           </w:p>
           <w:p>
@@ -20587,7 +20587,7 @@
                 <w:sz w:val="21"/>
                 <w:szCs w:val="21"/>
               </w:rPr>
-              <w:t xml:space="preserve">A fit is no forecast, so the curve is tested the way the plan will use it, and two choices decide the test. Where: the plan books weeks after the data ends, so the curve is fitted on the earlier weeks and scored on the latest weeks it never saw. Weeks drawn at random from the two years sit between weeks the curve was fitted on, so scoring there measures how well it fills gaps, close to its fit; Makridakis and colleagues found on 1,045 monthly series that the models that fitted best did not necessarily forecast best (PLOS ONE, 2018, checked 13 October 2026). Against what: on M5's unseen days the seasonal naive scored 0.847 and beat both machine-learning benchmarks on Exhibit 5C, 0.977 and 1.010, while every other entry on the exhibit beat the naive's 1.752, so on seasonal weeks beating the naive proves little; only 1,972 of the 5,507 teams, 35.8 percent, beat the seasonal naive (the M5 accuracy paper, checked 13 October 2026). The top entries that did win were machine learning, which is why the test is the same for any model. Friday's thirteen hidden weeks ran this test: the vendor's curve fitted its 91 training weeks within 1.4 percent and missed the hidden weeks by 16,400 shipments a week against the same-week copy's 9,831, almost all of it too high. Those weeks hold no festival, so a rolling origin that takes in 2025's festival is the next test, which Friday's fallback runs. Friday's deck teaches the held-back latest weeks in SECTION 3, Holding out; MAE and MAPE in the business's units (half one, S22 to S29), the bar in SECTION 2, Naive, seasonal naive and drift baselines (S14 to S21), and the curve tested in SECTION 4 (S30 to S37) and SECTION 6 (S49 to S59).</w:t>
+              <w:t xml:space="preserve">A fit is no forecast, so the curve is tested the way the plan will use it, and two choices decide the test. Where: the plan books weeks after the data ends, so the curve is fitted on the earlier weeks and scored on the latest weeks it never saw. Weeks drawn at random from the two years sit between weeks the curve was fitted on, so scoring there measures how well it fills gaps, close to its fit; Makridakis and colleagues found on 1,045 monthly series that the models that fitted best did not necessarily forecast best (PLOS ONE, 2018, checked 13 October 2026). Against what: on M5's unseen days the seasonal naive scored 0.847 and beat both machine-learning benchmarks on Exhibit 5C, 0.977 and 1.010, while every other entry on the exhibit beat the naive's 1.752, so on seasonal weeks beating the naive proves little; only 1,972 of the 5,507 teams, 35.8 percent, beat the seasonal naive (the M5 accuracy paper, checked 13 October 2026). The top entries that did win were machine learning, which is why the test is the same for any model. Friday's thirteen hidden weeks ran this test: the vendor's curve fitted its 91 training weeks within 1.4 percent and missed the hidden weeks by 16,400 shipments a week against the same-week copy's 9,831, almost all of it too high. Those weeks, beginning 29 June to 21 September 2026, hold no festival; Exhibit 5D does not print their dates, so give them when the room asks. A rolling origin that takes in 2025's festival is the next test, which Friday's fallback runs. Friday's deck teaches the held-back latest weeks in SECTION 3, Holding out; MAE and MAPE in the business's units (half one, S22 to S29), the bar in SECTION 2, Naive, seasonal naive and drift baselines (S14 to S21), and the curve tested in SECTION 4 (S30 to S37) and SECTION 6 (S49 to S59).</w:t>
             </w:r>
           </w:p>
           <w:p>
@@ -20816,7 +20816,7 @@
                 <w:sz w:val="21"/>
                 <w:szCs w:val="21"/>
               </w:rPr>
-              <w:t xml:space="preserve">Mean absolute error adds the misses with their signs dropped and divides by the weeks: 85,996 over 13 is 6,615 for festival-aligned, 127,800 over 13 is 9,831 for the copy of last year, and 213,200 over 13 is 16,400 for the vendor, about 148 percent above festival-aligned. Priced, a spare shipment costs Rs 5.42 and a late one Rs 25: the vendor's misses cost about Rs 11.9 lakh, festival-aligned's Rs 13.5 lakh and the copy's Rs 30.5 lakh, so the vendor is cheapest only because it errs high, the cheap side, by an amount nobody chose. The fair comparison sets each forecast at its plan share, its own 0.82 point, 25 over 25 plus 5.42: there festival-aligned and the copy cost about Rs 8.8 lakh each and the vendor Rs 10.0 lakh. These weeks hold no festival, so only the festival can separate festival-aligned from the copy, and the plan books festival-aligned raised toward its 0.82 point, because a late shipment costs about 4.6 times a spare one. Friday's deck teaches the error in the business's units in SECTION 3, Holding out; MAE and MAPE in the business's units (half one, S25 to S27), prices the misses in SECTION 6 (S55 to S58), and sets the plan share in its fallback (S10 to S13), beyond the row.</w:t>
+              <w:t xml:space="preserve">Mean absolute error adds the misses with their signs dropped and divides by the weeks: 85,996 over 13 is 6,615 for festival-aligned, 127,800 over 13 is 9,831 for the copy of last year, and 213,200 over 13 is 16,400 for the vendor, about 148 percent above festival-aligned. Priced, a spare shipment costs Rs 650 over 120, about Rs 5.42, and a late one Rs 25: the vendor's misses cost about Rs 11.9 lakh, festival-aligned's Rs 13.5 lakh and the copy's Rs 30.5 lakh, so the vendor is cheapest only because it errs high, the cheap side, by an amount nobody chose. The fair comparison sets each forecast at its plan share, its own 0.82 point, 25 over 25 plus 5.42: there festival-aligned and the copy cost about Rs 8.8 lakh each and the vendor Rs 10.0 lakh. These weeks, beginning 29 June to 21 September 2026, hold no festival, and Exhibit 5D does not print their dates, so give them when the room asks; only the festival can separate festival-aligned from the copy, and the plan books festival-aligned raised toward its 0.82 point, because a late shipment costs about 4.6 times a spare one. Friday's deck teaches the error in the business's units in SECTION 3, Holding out; MAE and MAPE in the business's units (half one, S25 to S27), prices the misses in SECTION 6 (S55 to S58), and sets the plan share in its fallback (S10 to S13), beyond the row.</w:t>
             </w:r>
           </w:p>
           <w:p>
@@ -21019,7 +21019,7 @@
                 <w:sz w:val="18"/>
                 <w:szCs w:val="18"/>
               </w:rPr>
-              <w:t xml:space="preserve">   One correct option, Hard, [D], Fri</w:t>
+              <w:t xml:space="preserve">   One correct option, Medium, [D], Fri</w:t>
             </w:r>
           </w:p>
           <w:p>
@@ -22015,7 +22015,7 @@
                 <w:sz w:val="18"/>
                 <w:szCs w:val="18"/>
               </w:rPr>
-              <w:t xml:space="preserve">   One correct option, Hard, [D], Sat</w:t>
+              <w:t xml:space="preserve">   One correct option, Medium, [D], Sat</w:t>
             </w:r>
           </w:p>
           <w:p>
@@ -22303,7 +22303,7 @@
           <w:sz w:val="21"/>
           <w:szCs w:val="21"/>
         </w:rPr>
-        <w:t xml:space="preserve">Medium (12): Q2, Q13, Q16, Q17, Q18, Q19, Q22, Q23, Q24, Q27, Q28, Q34</w:t>
+        <w:t xml:space="preserve">Medium (17): Q2, Q6, Q12, Q13, Q16, Q17, Q18, Q19, Q22, Q23, Q24, Q27, Q28, Q31, Q33, Q34, Q39</w:t>
       </w:r>
     </w:p>
     <w:p>
@@ -22322,7 +22322,7 @@
           <w:sz w:val="21"/>
           <w:szCs w:val="21"/>
         </w:rPr>
-        <w:t xml:space="preserve">Hard (18): Q4, Q6, Q7, Q8, Q9, Q10, Q12, Q14, Q15, Q20, Q21, Q25, Q26, Q30, Q31, Q32, Q33, Q39</w:t>
+        <w:t xml:space="preserve">Hard (13): Q4, Q7, Q8, Q9, Q10, Q14, Q15, Q20, Q21, Q25, Q26, Q30, Q32</w:t>
       </w:r>
     </w:p>
     <w:p>
@@ -22544,7 +22544,7 @@
           <w:sz w:val="21"/>
           <w:szCs w:val="21"/>
         </w:rPr>
-        <w:t xml:space="preserve">Q6 (One correct option, Hard, [F]): Exhibit 1C's last row is the 2013 change. Which two lines of a complete metric definition would have shown investors the 0.04, and kept the rest of that year's rise out of the ratio?</w:t>
+        <w:t xml:space="preserve">Q6 (One correct option, Medium, [F]): Exhibit 1C's last row is the 2013 change. Which two additions to the ratio's written definition would have shown investors the 0.04, and kept the rest of that year's rise out of the ratio?</w:t>
       </w:r>
     </w:p>
     <w:p>
@@ -22658,7 +22658,7 @@
           <w:sz w:val="21"/>
           <w:szCs w:val="21"/>
         </w:rPr>
-        <w:t xml:space="preserve">Q12 (Order the steps, Hard, [S]): The city head's afternoon ask is roughly how many drivers must be online at the weekday evening peak to keep the median rider wait under five minutes. The guesstimate runs clarify, map, calculate, validate: four of these six steps make it, and two would spoil it. Leave those two out and write the other four in the order they run.</w:t>
+        <w:t xml:space="preserve">Q12 (Order the steps, Medium, [S]): The city head's afternoon ask is roughly how many drivers must be online at the weekday evening peak to keep the median rider wait under five minutes. The guesstimate runs clarify, map, calculate, validate: four of these six steps make it, and two would spoil it. Leave those two out and write the other four in the order they run.</w:t>
       </w:r>
     </w:p>
     <w:p>
@@ -22886,7 +22886,7 @@
           <w:sz w:val="21"/>
           <w:szCs w:val="21"/>
         </w:rPr>
-        <w:t xml:space="preserve">Q31 (One correct option, Hard, [F]): The vendor's sponsor says: "Our curve fits two years of Lucknow's weeks within 2 percent, and machine learning won M5, so the curve should go to the plan." Using Exhibit 5C, which test must the curve pass before it goes to the plan?</w:t>
+        <w:t xml:space="preserve">Q31 (One correct option, Medium, [F]): The vendor's sponsor says: "Our curve fits two years of Lucknow's weeks within 2 percent, and machine learning won M5, so the curve should go to the plan." Using Exhibit 5C, which test must the curve pass before it goes to the plan?</w:t>
       </w:r>
     </w:p>
     <w:p>
@@ -22924,7 +22924,7 @@
           <w:sz w:val="21"/>
           <w:szCs w:val="21"/>
         </w:rPr>
-        <w:t xml:space="preserve">Q33 (One correct option, Hard, [D]): Anand asks which number goes in front of the board for October 2026 to March 2027, how wrong it could be, and whether the plan line can stand as the board's forecast. Using Exhibits 5A and 5E, which answer holds?</w:t>
+        <w:t xml:space="preserve">Q33 (One correct option, Medium, [D]): The plan line for the same six months is Rs 21.77 crore, the months a year earlier plus 15 percent. Anand asks which number goes in front of the board for October 2026 to March 2027, how wrong it could be, and whether the plan line can stand as the board's forecast. Using Exhibits 5A and 5E, which answer holds?</w:t>
       </w:r>
     </w:p>
     <w:p>
@@ -23019,7 +23019,7 @@
           <w:sz w:val="21"/>
           <w:szCs w:val="21"/>
         </w:rPr>
-        <w:t xml:space="preserve">Q39 (One correct option, Hard, [D]): Amazon India, a fulfilment centre's festive packer plan (illustrative case: the company is real, and every number below except Amazon's own figure is hypothetical). Amazon says its Great Indian Festival 2025 drew over 276 crore customer visits, 70 percent of them from tier 2 and 3 cities. Suppose its centre in a tier 2 city pays Rs 650 for an idle packer-shift of 120 shipments, as Lucknow does, while a late shipment costs it Rs 10, against Lucknow's Rs 25. What share of weeks should its plan cover, and what carries over from Lucknow unchanged?</w:t>
+        <w:t xml:space="preserve">Q39 (One correct option, Medium, [D]): Amazon India, a fulfilment centre's festive packer plan (illustrative case: the company is real, and every number below except Amazon's own figure is hypothetical). Amazon says its Great Indian Festival 2025 drew over 276 crore customer visits, 70 percent of them from tier 2 and 3 cities. Suppose its centre in a tier 2 city pays Rs 650 for an idle packer-shift of 120 shipments, as Lucknow does, while a late shipment costs it Rs 10, against Lucknow's Rs 25. What share of weeks should its plan cover, and what carries over from Lucknow unchanged?</w:t>
       </w:r>
     </w:p>
     <w:p>

</xml_diff>

<commit_message>
Saturday W04: Monday and Tuesday pointers name the rebuilt SECTIONs
Every item's note that pointed at a Monday or Tuesday chapter by name
now gives its SECTION and slide range in the rebuilt decks, as the
Wednesday to Friday notes already did, and anchors 1 to 3 of the
discussion guide do the same. No item, option, key letter or level
changed; the answer key was rebuilt from the source, and the key
proofs and the builder's check pass.

Co-Authored-By: Claude Opus 5.5 <noreply@anthropic.com>
Claude-Session: https://claude.ai/code/session_01MbrytHYNJFmUE4cNXhmkuj
</commit_message>
<xml_diff>
--- a/content/W04/SAT/answer-key/C2_W04_SAT_answer_key_TRAINER.docx
+++ b/content/W04/SAT/answer-key/C2_W04_SAT_answer_key_TRAINER.docx
@@ -14419,7 +14419,7 @@
                 <w:sz w:val="21"/>
                 <w:szCs w:val="21"/>
               </w:rPr>
-              <w:t xml:space="preserve">A north star names the outcome a plan exists to move, and a guardrail is a number that must not get worse while it rises, so it catches a harmful way of hitting the north star. On Monday's redesign the north star was completed peak trips per enrolled driver online at peak each week, and its guardrails were the share of offers accepted, the rider's wait by zone and the top-up per completed trip. Leading inputs move before the north star and proxies stand in for it, and neither catches harm. The singular words in the bank, window, baseline and target, do not fit the plural blank. Monday's deck teaches it in the chapter on North-star and guardrail metrics.</w:t>
+              <w:t xml:space="preserve">A north star names the outcome a plan exists to move, and a guardrail is a number that must not get worse while it rises, so it catches a harmful way of hitting the north star. On Monday's redesign the north star was completed peak trips per enrolled driver online at peak each week, and its guardrails were the share of offers accepted, the rider's wait by zone and the top-up per completed trip. Leading inputs move before the north star and proxies stand in for it, and neither catches harm. The singular words in the bank, window, baseline and target, do not fit the plural blank. Monday's deck teaches it in SECTION 2, North-star and guardrail metrics (half one, S14 to S21).</w:t>
             </w:r>
           </w:p>
           <w:p>
@@ -14567,7 +14567,7 @@
                 <w:sz w:val="21"/>
                 <w:szCs w:val="21"/>
               </w:rPr>
-              <w:t xml:space="preserve">A complete definition names its numerator, its denominator, its window and its exclusions, and the window is the period counted, which decides what a before-and-after comparison holds. Kalpa's growth-plan comparison started on 20 August because the monsoon sale ended on 19 August, so the sale's extra orders sat in neither window. A baseline is what a number is compared with, and a target is what the plan hopes it reaches; neither is part of the definition. Guardrails sit beside a definition as numbers of their own, and each word in the bank is used once, so guardrails belongs to Q1. Monday's deck teaches it in the chapter on Definitions: numerator, denominator, window, exclusions.</w:t>
+              <w:t xml:space="preserve">A complete definition names its numerator, its denominator, its window and its exclusions, and the window is the period counted, which decides what a before-and-after comparison holds. Kalpa's growth-plan comparison started on 20 August because the monsoon sale ended on 19 August, so the sale's extra orders sat in neither window. A baseline is what a number is compared with, and a target is what the plan hopes it reaches; neither is part of the definition. Guardrails sit beside a definition as numbers of their own, and each word in the bank is used once, so guardrails belongs to Q1. Monday's deck teaches it in SECTION 4, Definitions: numerator, denominator, window, exclusions (half one, S30 to S37).</w:t>
             </w:r>
           </w:p>
           <w:p>
@@ -14715,7 +14715,7 @@
                 <w:sz w:val="21"/>
                 <w:szCs w:val="21"/>
               </w:rPr>
-              <w:t xml:space="preserve">False. A leading indicator moves before the north star, while a team can still act on it; a lagging number confirms later. Rider requests per peak online hour, by zone, say where riders are waiting before the week's completed trips are counted, so the city can send drivers there. It fell from 2.13 to 1.75 because the new online hours went where riders were few, while the north star barely moved, from 35.76 to 35.89 trips per online driver-week (Monday's case data). Monday's deck teaches it in the chapter on Leading against lagging indicators.</w:t>
+              <w:t xml:space="preserve">False. A leading indicator moves before the north star, while a team can still act on it; a lagging number confirms later. Rider requests per peak online hour, by zone, say where riders are waiting before the week's completed trips are counted, so the city can send drivers there. It fell from 2.13 to 1.75 because the new online hours went where riders were few, while the north star barely moved, from 35.76 to 35.89 trips per online driver-week (Monday's case data). Monday's deck teaches it in SECTION 3, Leading against lagging indicators (half one, S22 to S29).</w:t>
             </w:r>
           </w:p>
           <w:p>
@@ -14944,7 +14944,7 @@
                 <w:sz w:val="21"/>
                 <w:szCs w:val="21"/>
               </w:rPr>
-              <w:t xml:space="preserve">Summed, the six drivers' hours went from 60 to 74 while their trips fell from 114 to 88, so trips per online hour fell from 1.90 to 1.19: add the trips, add the hours, divide once. The 1.31 is the average of each driver's own rate, which gives a 10-hour week the weight of a 16-hour week and so understates how far the six fell. The six fall further than the city because they were picked to show the mechanism: E and F, in two of the three outer zones, added 10 hours between them and lost 30 trips, a third of this sample against 15 percent of the city's 1,200 drivers in the idle tail (Monday's case data). So the size goes to the city head as the city's own 1.90 to 1.58 from Exhibit 1A, about 17 percent, with E and F as where the new hours went. The note itself fails the proxy test: a number hit while the outcome got worse. Monday's deck teaches the proxy test in the chapter on What to measure and why; the proxy test, and runs it on the twelve rows in the first case chapter.</w:t>
+              <w:t xml:space="preserve">Summed, the six drivers' hours went from 60 to 74 while their trips fell from 114 to 88, so trips per online hour fell from 1.90 to 1.19: add the trips, add the hours, divide once. The 1.31 is the average of each driver's own rate, which gives a 10-hour week the weight of a 16-hour week and so understates how far the six fell. The six fall further than the city because they were picked to show the mechanism: E and F, in two of the three outer zones, added 10 hours between them and lost 30 trips, a third of this sample against 15 percent of the city's 1,200 drivers in the idle tail (Monday's case data). So the size goes to the city head as the city's own 1.90 to 1.58 from Exhibit 1A, about 17 percent, with E and F as where the new hours went. The note itself fails the proxy test: a number hit while the outcome got worse. Monday's deck teaches the proxy test in SECTION 1, What to measure and why; the proxy test (half one, S6 to S13), and runs it on the twelve rows in SECTION 7 (S54 to S63).</w:t>
             </w:r>
           </w:p>
           <w:p>
@@ -15173,7 +15173,7 @@
                 <w:sz w:val="21"/>
                 <w:szCs w:val="21"/>
               </w:rPr>
-              <w:t xml:space="preserve">True. Staff measured on the cross-sell count changed what they did to move it, in ways the bank never meant: accounts customers had not asked for, money moved in so a new account counted as funded, and contact details changed so surveys missed the customers (SEC order, Release 34-88257, checked 13 October 2026). The same thing happened on a smaller scale in Hyderabad, where 180 drivers took their peak online hours to 2.1 times while their trips fell 12 percent. The 2016 penalties, the CFPB's USD 100 million with the OCC's USD 35 million and Los Angeles's USD 50 million, came to USD 185 million between them by our sum (the CFPB's release of 8 September 2016, checked 13 October 2026), and the 2020 settlement with the SEC and the Justice Department to USD 3 billion. Monday's deck teaches it in the chapter on What to measure and why; the proxy test, where Wells Fargo is the case, and in the chapter on Gaming, and definitions that resist it.</w:t>
+              <w:t xml:space="preserve">True. Staff measured on the cross-sell count changed what they did to move it, in ways the bank never meant: accounts customers had not asked for, money moved in so a new account counted as funded, and contact details changed so surveys missed the customers (SEC order, Release 34-88257, checked 13 October 2026). The same thing happened on a smaller scale in Hyderabad, where 180 drivers took their peak online hours to 2.1 times while their trips fell 12 percent. The 2016 penalties, the CFPB's USD 100 million with the OCC's USD 35 million and Los Angeles's USD 50 million, came to USD 185 million between them by our sum (the CFPB's release of 8 September 2016, checked 13 October 2026), and the 2020 settlement with the SEC and the Justice Department to USD 3 billion. Monday's deck teaches it in SECTION 1, What to measure and why; the proxy test (half one, S6 to S13, with Wells Fargo on S13), and in SECTION 5, Gaming, and definitions that resist it (S38 to S45).</w:t>
             </w:r>
           </w:p>
           <w:p>
@@ -15402,7 +15402,7 @@
                 <w:sz w:val="21"/>
                 <w:szCs w:val="21"/>
               </w:rPr>
-              <w:t xml:space="preserve">Two different things raised the ratio in 2013, and each needs its own addition. The 0.04, about 36 percent of the 0.11 rise, came from a change of what is counted: remittance accounts that already existed joined the count. The addition that shows a change of definition is a dated change log, with the year of the change printed on both definitions, so a reader sees a step and never reads it as growth; Monday's seven lines ask that each exclusion be dated if it changes, and the log keeps that date for every change to what is counted. A guardrail on revenue per household could not show it, since accounts that already existed had already earned their revenue, so nothing beside the ratio would move when they joined the count; a guardrail is a second number and keeps nothing out of the ratio itself. The rest of the rise came from more accounts and products inactive for at least 365 days (the SEC's order, Release 34-88257, paragraph 42, checked 13 October 2026), and the count carried no condition on use, so an unused debit card could stay in it for up to four years. An exclusion that drops any product unused for a year keeps that rest out. Dropping the remittance accounts added that year takes out the 0.04 the log exists to show and leaves the rest, the products unused for at least 365 days, in the ratio. The order says investors were never told of the 2013 addition, which is the breach the change log exists to prevent. Monday's deck teaches the four lines of a definition in the chapter on Definitions: numerator, denominator, window, exclusions, gaming in the chapter on Gaming, and definitions that resist it, and the page that carries both in the chapter on The metric definition artifact.</w:t>
+              <w:t xml:space="preserve">Two different things raised the ratio in 2013, and each needs its own addition. The 0.04, about 36 percent of the 0.11 rise, came from a change of what is counted: remittance accounts that already existed joined the count. The addition that shows a change of definition is a dated change log, with the year of the change printed on both definitions, so a reader sees a step and never reads it as growth; Monday's seven lines ask that each exclusion be dated if it changes, and the log keeps that date for every change to what is counted. A guardrail on revenue per household could not show it, since accounts that already existed had already earned their revenue, so nothing beside the ratio would move when they joined the count; a guardrail is a second number and keeps nothing out of the ratio itself. The rest of the rise came from more accounts and products inactive for at least 365 days (the SEC's order, Release 34-88257, paragraph 42, checked 13 October 2026), and the count carried no condition on use, so an unused debit card could stay in it for up to four years. An exclusion that drops any product unused for a year keeps that rest out. Dropping the remittance accounts added that year takes out the 0.04 the log exists to show and leaves the rest, the products unused for at least 365 days, in the ratio. The order says investors were never told of the 2013 addition, which is the breach the change log exists to prevent. Monday's deck teaches the four lines of a definition in SECTION 4, Definitions: numerator, denominator, window, exclusions (half one, S30 to S37), gaming in SECTION 5, Gaming, and definitions that resist it (S38 to S45), and the page that carries both in SECTION 6, The metric definition artifact (S46 to S53).</w:t>
             </w:r>
           </w:p>
           <w:p>
@@ -15631,7 +15631,7 @@
                 <w:sz w:val="21"/>
                 <w:szCs w:val="21"/>
               </w:rPr>
-              <w:t xml:space="preserve">The lab found placements per member up 1.22 times while their booked value per member fell to 0.96, and none of the window's placements became an order a member received: the app placed low-value reorders on its own. So the exclusions drop placements nobody received (c); revenue per active customer guards against frequency bought with small orders (d); and add-to-cart events move before the month's delivered orders, while a team can act on them (e). The growth plan's north star, as the lab's exercise wrote it, is delivered orders per active customer per month. Monday's deck teaches the sheet's lines in the chapters on North-star and guardrail metrics, Leading against lagging indicators and The metric definition artifact, and the lab finds Exhibit 1D.</w:t>
+              <w:t xml:space="preserve">The lab found placements per member up 1.22 times while their booked value per member fell to 0.96, and none of the window's placements became an order a member received: the app placed low-value reorders on its own. So the exclusions drop placements nobody received (c); revenue per active customer guards against frequency bought with small orders (d); and add-to-cart events move before the month's delivered orders, while a team can act on them (e). The growth plan's north star, as the lab's exercise wrote it, is delivered orders per active customer per month. Monday's deck teaches the sheet's lines in SECTION 2, North-star and guardrail metrics (half one, S14 to S21), SECTION 3, Leading against lagging indicators (S22 to S29), and SECTION 6, The metric definition artifact (S46 to S53), and the lab finds Exhibit 1D.</w:t>
             </w:r>
           </w:p>
           <w:p>
@@ -15833,7 +15833,7 @@
                 <w:sz w:val="21"/>
                 <w:szCs w:val="21"/>
               </w:rPr>
-              <w:t xml:space="preserve">The stem prints the slots' order, claim, evidence, caveat, action, so the item is which line fills each slot, and three choices decide it. The claim reads the denominator the scheme pays for: the guarantee pays per peak online hour, so the title is that it pays for hours that carry no trips (e). Bookings per active driver-week rose 0.8 percent, Rs 5,817 to Rs 5,861, only because each driver-week carried about four more online hours while each hour earned Rs 54 less, so a title built on it reads the flattering denominator (c). The evidence is the hour's bookings, and a fall is measured against where it started: Rs 314 less Rs 260 is Rs 54, 17 percent of Rs 314 (b); 21 percent divides the same Rs 54 by the Rs 260 it fell to (g). The caveat leaves part of the fall to the season, and the action answers it: a test on half the drivers, picked at random, runs the old pay and the new in the same weeks, so the season falls on both halves and the difference is the redesign's (f). Moving every driver at once (a) leaves nothing to compare with, so the season and the redesign stay mixed. Tuesday's deck teaches the four slots in the chapter on The one-slide answer: claim, evidence, caveat, action, and Monday's deck the denominator the scheme pays for.</w:t>
+              <w:t xml:space="preserve">The stem prints the slots' order, claim, evidence, caveat, action, so the item is which line fills each slot, and three choices decide it. The claim reads the denominator the scheme pays for: the guarantee pays per peak online hour, so the title is that it pays for hours that carry no trips (e). Bookings per active driver-week rose 0.8 percent, Rs 5,817 to Rs 5,861, only because each driver-week carried about four more online hours while each hour earned Rs 54 less, so a title built on it reads the flattering denominator (c). The evidence is the hour's bookings, and a fall is measured against where it started: Rs 314 less Rs 260 is Rs 54, 17 percent of Rs 314 (b); 21 percent divides the same Rs 54 by the Rs 260 it fell to (g). The caveat leaves part of the fall to the season, and the action answers it: a test on half the drivers, picked at random, runs the old pay and the new in the same weeks, so the season falls on both halves and the difference is the redesign's (f). Moving every driver at once (a) leaves nothing to compare with, so the season and the redesign stay mixed. Tuesday's deck teaches the four slots in SECTION 1, The one-slide answer: claim, evidence, caveat, action (half one, S6 to S13), and Monday's SECTION 9 (half one, S74 to S84) the denominator the scheme pays for.</w:t>
             </w:r>
           </w:p>
           <w:p>
@@ -16062,7 +16062,7 @@
                 <w:sz w:val="21"/>
                 <w:szCs w:val="21"/>
               </w:rPr>
-              <w:t xml:space="preserve">The claim has two halves. "Riders got little" is what riders received, and the wait barely moved, from 4.8 to 4.6 minutes; rider requests are what riders asked for, so they cannot show what riders got. "For the Rs 1.9 crore" is the price of what the money bought: Rs 1.9 crore over the 6,700 extra peak trips (230,900 against 224,200, Exhibit 1A) is about Rs 2,836 for a trip worth Rs 165. Rs 82 a completed trip spreads the same money over all 230,900 trips, though the six weeks before carried 224,200 with no top-up at all, so it prices the average trip and hides how little the money bought. Requests go to marketing's page, the Rs 82 to finance's and the 61 percent split to the page that answers where the money went; the caveat, which this draft does not list, would stay on the slide. Tuesday's deck teaches it in the chapter on What to leave out, and the appendix.</w:t>
+              <w:t xml:space="preserve">The claim has two halves. "Riders got little" is what riders received, and the wait barely moved, from 4.8 to 4.6 minutes; rider requests are what riders asked for, so they cannot show what riders got. "For the Rs 1.9 crore" is the price of what the money bought: Rs 1.9 crore over the 6,700 extra peak trips (230,900 against 224,200, Exhibit 1A) is about Rs 2,836 for a trip worth Rs 165. Rs 82 a completed trip spreads the same money over all 230,900 trips, though the six weeks before carried 224,200 with no top-up at all, so it prices the average trip and hides how little the money bought. Requests go to marketing's page, the Rs 82 to finance's and the 61 percent split to the page that answers where the money went; the caveat, which this draft does not list, would stay on the slide. Tuesday's deck teaches it in SECTION 2, What to leave out, and the appendix (half one, S14 to S19).</w:t>
             </w:r>
           </w:p>
           <w:p>
@@ -16291,7 +16291,7 @@
                 <w:sz w:val="21"/>
                 <w:szCs w:val="21"/>
               </w:rPr>
-              <w:t xml:space="preserve">False. The defence has four moves: restate the objection until its owner agrees, answer from the evidence, concede what is true, and say what would change your mind. Finance is partly right, since the rains ended inside the six weeks and no weeks from last year are in the data, so the true part is conceded in the open. The evidence then has to answer the season where the season shows. Over the six weeks requests rose 1.8 percent, but on Exhibit 2B the first three weeks after the launch ran 43,507 to 43,878, above every week before it, and then requests fell four weeks running from 7 September; the six-week total hides that fall, so it cannot answer an objection that the season thinned demand. Even after the fall, the last three weeks ran 41,161 to 42,602, inside the 41,155 to 42,719 of the six weeks before; the lowest sits only 6 requests above that floor, so a learner who reads the last week as back at the floor of the old range has read it right. Through those weeks trips per peak online hour held at 1.55 to 1.56 against 1.88 to 1.93: riders asked as often as before the launch and each online hour still carried fewer trips, which a thinner season cannot explain. What would change the analyst's mind is a city where the rains ended and no scheme launched, with trips per hour falling as far. Tuesday's deck teaches the four moves in the chapter on Defending under challenge: restate, answer, concede, what would change your mind, and Monday's deck the window a comparison is read over, in the chapter on Definitions: numerator, denominator, window, exclusions.</w:t>
+              <w:t xml:space="preserve">False. The defence has four moves: restate the objection until its owner agrees, answer from the evidence, concede what is true, and say what would change your mind. Finance is partly right, since the rains ended inside the six weeks and no weeks from last year are in the data, so the true part is conceded in the open. The evidence then has to answer the season where the season shows. Over the six weeks requests rose 1.8 percent, but on Exhibit 2B the first three weeks after the launch ran 43,507 to 43,878, above every week before it, and then requests fell four weeks running from 7 September; the six-week total hides that fall, so it cannot answer an objection that the season thinned demand. Even after the fall, the last three weeks ran 41,161 to 42,602, inside the 41,155 to 42,719 of the six weeks before; the lowest sits only 6 requests above that floor, so a learner who reads the last week as back at the floor of the old range has read it right. Through those weeks trips per peak online hour held at 1.55 to 1.56 against 1.88 to 1.93: riders asked as often as before the launch and each online hour still carried fewer trips, which a thinner season cannot explain. What would change the analyst's mind is a city where the rains ended and no scheme launched, with trips per hour falling as far. Tuesday's deck teaches the four moves in SECTION 3, Defending under challenge: restate, answer, concede, what would change your mind (half one, S20 to S27), and Monday's deck the window a comparison is read over, in SECTION 4, Definitions: numerator, denominator, window, exclusions (half one, S30 to S37).</w:t>
             </w:r>
           </w:p>
           <w:p>
@@ -16520,7 +16520,7 @@
                 <w:sz w:val="21"/>
                 <w:szCs w:val="21"/>
               </w:rPr>
-              <w:t xml:space="preserve">False. The ask is one slide, five minutes, at Thursday's review, and the letter's own key point is that a great memo probably should take a week or more (Amazon's 2017 letter to shareholders, filed 18 April 2018, checked 13 October 2026). A memo serves a reader with an hour and a writer with a week; the city head asked for five minutes. The afternoon's written case was the memo form of the same answer, for a reader with the time to read it. Tuesday's deck teaches it in the chapter on The AI-free written business case, where Amazon's memo sits.</w:t>
+              <w:t xml:space="preserve">False. The ask is one slide, five minutes, at Thursday's review, and the letter's own key point is that a great memo probably should take a week or more (Amazon's 2017 letter to shareholders, filed 18 April 2018, checked 13 October 2026). A memo serves a reader with an hour and a writer with a week; the city head asked for five minutes. The afternoon's written case was the memo form of the same answer, for a reader with the time to read it. Tuesday's deck teaches it in SECTION 7, The AI-free written business case (half two, S64 to S69), where Amazon's memo sits on S66.</w:t>
             </w:r>
           </w:p>
           <w:p>
@@ -16749,7 +16749,7 @@
                 <w:sz w:val="21"/>
                 <w:szCs w:val="21"/>
               </w:rPr>
-              <w:t xml:space="preserve">Clarify (b), map (d), calculate (e), validate (a). The chain's numbers are assumptions said aloud: about 1 crore people, 1 weekday Uber trip for every 100 people, a quarter of the day's trips in the three evening hours, 2.4 trips an hour for a busy driver with about 30 percent of online drivers idle at a moment, so 1.68 trips per online driver-hour, and a buffer of 1.15. The check sets the assumed 1.68 against a measured rate in the same unit, trips per peak online hour, from weeks that met the goal without paying for idle hours: 1.90 before the launch, at a 4.8-minute median wait. Re-run there, 8,333 trips over 1.90 times 1.15 is about 5,040, so the answer moves down to about 5,000. Two checks spoil it, each a mistake analysts make. Step c re-runs the chain on rider requests per online hour, a different unit: requests ran above trips (251,910 against 224,200 before the launch), so 2.13 overstates what an online hour completes and the answer lands near 4,500. Step f takes the latest weeks, and Exhibit 1A shows why they mislead: after the launch the guarantee paid for online hours that carried no trips, so 1.58 counts idle hours the wait did not need, and the extra hours bought 0.2 minutes, 4.8 to 4.6; re-run at 1.58 the chain asks for about 6,100 drivers, the idle tail included. Tuesday's deck teaches the four steps in the chapter on The guesstimate: clarify, map, calculate, validate, and Monday's deck the idle hours the guarantee paid for.</w:t>
+              <w:t xml:space="preserve">Clarify (b), map (d), calculate (e), validate (a). The chain's numbers are assumptions said aloud: about 1 crore people, 1 weekday Uber trip for every 100 people, a quarter of the day's trips in the three evening hours, 2.4 trips an hour for a busy driver with about 30 percent of online drivers idle at a moment, so 1.68 trips per online driver-hour, and a buffer of 1.15. The check sets the assumed 1.68 against a measured rate in the same unit, trips per peak online hour, from weeks that met the goal without paying for idle hours: 1.90 before the launch, at a 4.8-minute median wait. Re-run there, 8,333 trips over 1.90 times 1.15 is about 5,040, so the answer moves down to about 5,000. Two checks spoil it, each a mistake analysts make. Step c re-runs the chain on rider requests per online hour, a different unit: requests ran above trips (251,910 against 224,200 before the launch), so 2.13 overstates what an online hour completes and the answer lands near 4,500. Step f takes the latest weeks, and Exhibit 1A shows why they mislead: after the launch the guarantee paid for online hours that carried no trips, so 1.58 counts idle hours the wait did not need, and the extra hours bought 0.2 minutes, 4.8 to 4.6; re-run at 1.58 the chain asks for about 6,100 drivers, the idle tail included. Tuesday's deck teaches the four steps in SECTION 6, The guesstimate: clarify, map, calculate, validate (half two, S56 to S63), and Monday's SECTION 8 (half one, S64 to S73) the idle hours the guarantee paid for.</w:t>
             </w:r>
           </w:p>
           <w:p>
@@ -16951,7 +16951,7 @@
                 <w:sz w:val="21"/>
                 <w:szCs w:val="21"/>
               </w:rPr>
-              <w:t xml:space="preserve">Two hold. NPCI's 24.07 billion for September 2026, over that month's 30 days, is the 802 million a day Outlook Money reported (2 October 2026, checked 13 October 2026), and a per-day estimate is compared per day. DMart's revenue spread over the stores open across the year, the average of 415 and 500, gives about Rs 146 crore a store (Avenue Supermarts, 2 May 2026, checked 13 October 2026). It is a rough check: 58 of the 85 new stores opened in the last quarter, so with openings spread evenly the year held about 439 store-years, about Rs 152 crore each, and a first-year estimate sits below either figure. Flipkart's own words say 6.3 million concurrent users in a minute, and 63 is the number in the post's web address, a decimal point lost. The drill city's households are right at 5 lakh, and households are not users: a household of four holds several people who pay, so the check sets households against people. Tuesday's deck teaches the validate step and its sanity tests in the chapter on The guesstimate: clarify, map, calculate, validate, and the lab checks Anand's new store against DMart.</w:t>
+              <w:t xml:space="preserve">Two hold. NPCI's 24.07 billion for September 2026, over that month's 30 days, is the 802 million a day Outlook Money reported (2 October 2026, checked 13 October 2026), and a per-day estimate is compared per day. DMart's revenue spread over the stores open across the year, the average of 415 and 500, gives about Rs 146 crore a store (Avenue Supermarts, 2 May 2026, checked 13 October 2026). It is a rough check: 58 of the 85 new stores opened in the last quarter, so with openings spread evenly the year held about 439 store-years, about Rs 152 crore each, and a first-year estimate sits below either figure. Flipkart's own words say 6.3 million concurrent users in a minute, and 63 is the number in the post's web address, a decimal point lost. The drill city's households are right at 5 lakh, and households are not users: a household of four holds several people who pay, so the check sets households against people. Tuesday's deck teaches the validate step and its sanity tests in SECTION 6, The guesstimate: clarify, map, calculate, validate (half two, S56 to S63), and the lab checks Anand's new store against DMart.</w:t>
             </w:r>
           </w:p>
           <w:p>
@@ -17180,7 +17180,7 @@
                 <w:sz w:val="21"/>
                 <w:szCs w:val="21"/>
               </w:rPr>
-              <w:t xml:space="preserve">Two things are wrong with the pair's check, and both have to be fixed. DMRC's journeys count each line a passenger uses to reach a destination, so a trip with one change of line counts twice (Deccan Herald, reporting PTI, 30 August 2023, checked 13 October 2026), and the chain counts trips gate to gate. When DMRC began counting lines, in 2018, it read 45,35,932 line uses on 29 May against nearly 27 lakh commuters a day in February (PTI, 30 May 2018, via LatestLY, checked 13 October 2026), about 1.68 line uses a rider. At that mix the average day's 64.06 lakh journeys are about 38 lakh trips, and the chain's 60 lakh runs about 57 percent high, so its trips per person are checked and the answer moves down, never up. The conversion is rough, two counts from different months of 2018, and the call does not hang on it: any mix above about 1.07 line uses a rider puts the average day below 60 lakh trips. The check also needs an ordinary day: 82,44,903 was one record day, during a bus strike, so it checks nothing about a weekday. Tuesday's deck teaches the check in the chapter on The guesstimate: clarify, map, calculate, validate, where a published number is read in its own unit before the answer moves toward it, and Monday's deck uses Delhi Metro's count in the chapter on Definitions: numerator, denominator, window, exclusions.</w:t>
+              <w:t xml:space="preserve">Two things are wrong with the pair's check, and both have to be fixed. DMRC's journeys count each line a passenger uses to reach a destination, so a trip with one change of line counts twice (Deccan Herald, reporting PTI, 30 August 2023, checked 13 October 2026), and the chain counts trips gate to gate. When DMRC began counting lines, in 2018, it read 45,35,932 line uses on 29 May against nearly 27 lakh commuters a day in February (PTI, 30 May 2018, via LatestLY, checked 13 October 2026), about 1.68 line uses a rider. At that mix the average day's 64.06 lakh journeys are about 38 lakh trips, and the chain's 60 lakh runs about 57 percent high, so its trips per person are checked and the answer moves down, never up. The conversion is rough, two counts from different months of 2018, and the call does not hang on it: any mix above about 1.07 line uses a rider puts the average day below 60 lakh trips. The check also needs an ordinary day: 82,44,903 was one record day, during a bus strike, so it checks nothing about a weekday. Tuesday's deck teaches the check in SECTION 6, The guesstimate: clarify, map, calculate, validate (half two, S56 to S63), where a published number is read in its own unit before the answer moves toward it, and reads DMRC's record day on S81; Monday's deck uses Delhi Metro's count in SECTION 4, Definitions: numerator, denominator, window, exclusions (half one, S37).</w:t>
             </w:r>
           </w:p>
           <w:p>
@@ -21274,7 +21274,7 @@
                 <w:sz w:val="21"/>
                 <w:szCs w:val="21"/>
               </w:rPr>
-              <w:t xml:space="preserve">The method carries over: the metric written with its numerator, denominator and window; a guardrail the people measured cannot move; and a test against a baseline before any lift is trusted. What changes is the cost of an error, since a nudge toward a loan that defaults costs Kalpa Financial Services twenty times what it loses by passing over a good customer, so the rupee cost of a wrong nudge in each direction is the line Rohan Desai's version rewrites. On the Retail tables a wrong nudge cost a discount and some annoyance, so the same threshold would sit in a very different place. Each method comes from its day: the definition and the guardrail from Monday's chapters on Definitions: numerator, denominator, window, exclusions and North-star and guardrail metrics, and the test against a baseline from Wednesday's SECTION 6 (half one, S31 to S35) and Friday's SECTION 4 (half one, S30 to S37).</w:t>
+              <w:t xml:space="preserve">The method carries over: the metric written with its numerator, denominator and window; a guardrail the people measured cannot move; and a test against a baseline before any lift is trusted. What changes is the cost of an error, since a nudge toward a loan that defaults costs Kalpa Financial Services twenty times what it loses by passing over a good customer, so the rupee cost of a wrong nudge in each direction is the line Rohan Desai's version rewrites. On the Retail tables a wrong nudge cost a discount and some annoyance, so the same threshold would sit in a very different place. Each method comes from its day: the definition and the guardrail from Monday's SECTION 4, Definitions: numerator, denominator, window, exclusions (half one, S30 to S37), and SECTION 2, North-star and guardrail metrics (S14 to S21), and the test against a baseline from Wednesday's SECTION 6 (half one, S31 to S35) and Friday's SECTION 4 (half one, S30 to S37).</w:t>
             </w:r>
           </w:p>
           <w:p>
@@ -21449,7 +21449,7 @@
                 <w:sz w:val="21"/>
                 <w:szCs w:val="21"/>
               </w:rPr>
-              <w:t xml:space="preserve">The rate's window ends at a promised date the measured dispatchers can move, the way the Phoenix VA's wait times ran from a "desired date" that 30 of the 79 scheduling staff interviewed said they entered wrongly (VA Office of Inspector General, report 14-02603-267, 26 August 2014, checked 13 October 2026); the fix fixes the promise when the order is placed and guards it with the share of promises moved. What changed from Uber: the people who move the number are dispatchers, and the cost of an error is a customer told a parcel was on time when it was not. The method is Monday's chapter on Gaming, and definitions that resist it.</w:t>
+              <w:t xml:space="preserve">The rate's window ends at a promised date the measured dispatchers can move, the way the Phoenix VA's wait times ran from a "desired date" that 30 of the 79 scheduling staff interviewed said they entered wrongly (VA Office of Inspector General, report 14-02603-267, 26 August 2014, checked 13 October 2026); the fix fixes the promise when the order is placed and guards it with the share of promises moved. What changed from Uber: the people who move the number are dispatchers, and the cost of an error is a customer told a parcel was on time when it was not. The method is Monday's SECTION 5, Gaming, and definitions that resist it (half one, S38 to S45).</w:t>
             </w:r>
           </w:p>
           <w:p>

</xml_diff>